<commit_message>
Update docs: Russian adaptation section, updated metrics (88 countries, 59 profiles)
</commit_message>
<xml_diff>
--- a/Relocation_Recommender_Documentation.docx
+++ b/Relocation_Recommender_Documentation.docx
@@ -125,7 +125,21 @@
           <w:sz w:val="22"/>
           <w:szCs w:val="22"/>
         </w:rPr>
-        <w:t xml:space="preserve">Выбор страны для переезда — многомерная задача, в которой пользователь должен балансировать десятки факторов: стоимость жизни, безопасность, качество медицины, простоту визового режима, климат, языковой барьер и др. Существующие источники (Numbeo, Nomad List) дают лишь сырые рейтинги, не учитывая индивидуальные приоритеты.</w:t>
+        <w:t xml:space="preserve">Выбор страны для переезда — многомерная задача, в которой пользователь должен балансировать десятки факторов: стоимость жизни, безопасность, качество медицины, простоту визового режима, климат, языковой барьер и др. Существующие источники (Numbeo, Nomad List) дают лишь сырые рейтинги, не учитывая индивидуальные приоритеты пользователя.</w:t>
+      </w:r>
+    </w:p>
+    <w:p>
+      <w:pPr>
+        <w:spacing w:after="120" w:line="300"/>
+        <w:jc w:val="left"/>
+      </w:pPr>
+      <w:r>
+        <w:rPr>
+          <w:rFonts w:ascii="Calibri" w:cs="Calibri" w:eastAsia="Calibri" w:hAnsi="Calibri"/>
+          <w:sz w:val="22"/>
+          <w:szCs w:val="22"/>
+        </w:rPr>
+        <w:t xml:space="preserve">Особую актуальность задача приобрела в контексте россиян: с 2022 года граждане РФ сталкиваются с уникальными ограничениями — санкциями, проблемами с банковским обслуживанием, закрытием части направлений. Система учитывает эти факторы как первоклассные признаки.</w:t>
       </w:r>
     </w:p>
     <w:p>
@@ -174,7 +188,7 @@
           <w:sz w:val="22"/>
           <w:szCs w:val="22"/>
         </w:rPr>
-        <w:t xml:space="preserve">Собирает данные о странах из открытых источников (87 стран × 20 признаков)</w:t>
+        <w:t xml:space="preserve">Собирает данные о странах из открытых источников (88 стран × 23 признака)</w:t>
       </w:r>
     </w:p>
     <w:p>
@@ -210,7 +224,7 @@
           <w:sz w:val="22"/>
           <w:szCs w:val="22"/>
         </w:rPr>
-        <w:t xml:space="preserve">Принимает структурированный профиль пользователя (бюджет, приоритеты, языки)</w:t>
+        <w:t xml:space="preserve">Принимает структурированный профиль пользователя (бюджет, приоритеты, языки, гражданство)</w:t>
       </w:r>
     </w:p>
     <w:p>
@@ -229,6 +243,24 @@
           <w:szCs w:val="22"/>
         </w:rPr>
         <w:t xml:space="preserve">Выдаёт топ-N стран с объяснением каждой рекомендации</w:t>
+      </w:r>
+    </w:p>
+    <w:p>
+      <w:pPr>
+        <w:pStyle w:val="ListParagraph"/>
+        <w:numPr>
+          <w:ilvl w:val="0"/>
+          <w:numId w:val="2"/>
+        </w:numPr>
+        <w:spacing w:after="60"/>
+      </w:pPr>
+      <w:r>
+        <w:rPr>
+          <w:rFonts w:ascii="Calibri" w:cs="Calibri" w:eastAsia="Calibri" w:hAnsi="Calibri"/>
+          <w:sz w:val="22"/>
+          <w:szCs w:val="22"/>
+        </w:rPr>
+        <w:t xml:space="preserve">Учитывает российский контекст: безвизовый въезд, санкции, банкинг</w:t>
       </w:r>
     </w:p>
     <w:p>
@@ -433,7 +465,7 @@
                 <w:sz w:val="20"/>
                 <w:szCs w:val="20"/>
               </w:rPr>
-              <w:t xml:space="preserve">Hit Rate (идеал в топ-10)</w:t>
+              <w:t xml:space="preserve">Hit Rate (все профили)</w:t>
             </w:r>
           </w:p>
         </w:tc>
@@ -464,7 +496,7 @@
                 <w:sz w:val="20"/>
                 <w:szCs w:val="20"/>
               </w:rPr>
-              <w:t xml:space="preserve">96.0 %</w:t>
+              <w:t xml:space="preserve">96.6 %</w:t>
             </w:r>
           </w:p>
         </w:tc>
@@ -495,7 +527,7 @@
                 <w:sz w:val="20"/>
                 <w:szCs w:val="20"/>
               </w:rPr>
-              <w:t xml:space="preserve">48 из 50 синтетических профилей</w:t>
+              <w:t xml:space="preserve">57 из 59 синтетических профилей</w:t>
             </w:r>
           </w:p>
         </w:tc>
@@ -529,7 +561,7 @@
                 <w:sz w:val="20"/>
                 <w:szCs w:val="20"/>
               </w:rPr>
-              <w:t xml:space="preserve">NDCG@10 baseline</w:t>
+              <w:t xml:space="preserve">Hit Rate (российские)</w:t>
             </w:r>
           </w:p>
         </w:tc>
@@ -561,7 +593,7 @@
                 <w:sz w:val="20"/>
                 <w:szCs w:val="20"/>
               </w:rPr>
-              <w:t xml:space="preserve">0.7906</w:t>
+              <w:t xml:space="preserve">100.0 %</w:t>
             </w:r>
           </w:p>
         </w:tc>
@@ -593,7 +625,7 @@
                 <w:sz w:val="20"/>
                 <w:szCs w:val="20"/>
               </w:rPr>
-              <w:t xml:space="preserve">Косинусная модель без RL</w:t>
+              <w:t xml:space="preserve">9 из 9 российских профилей</w:t>
             </w:r>
           </w:p>
         </w:tc>
@@ -626,7 +658,7 @@
                 <w:sz w:val="20"/>
                 <w:szCs w:val="20"/>
               </w:rPr>
-              <w:t xml:space="preserve">NDCG@10 LinUCB</w:t>
+              <w:t xml:space="preserve">NDCG@10 (все)</w:t>
             </w:r>
           </w:p>
         </w:tc>
@@ -657,7 +689,7 @@
                 <w:sz w:val="20"/>
                 <w:szCs w:val="20"/>
               </w:rPr>
-              <w:t xml:space="preserve">0.3491*</w:t>
+              <w:t xml:space="preserve">0.7608</w:t>
             </w:r>
           </w:p>
         </w:tc>
@@ -688,7 +720,7 @@
                 <w:sz w:val="20"/>
                 <w:szCs w:val="20"/>
               </w:rPr>
-              <w:t xml:space="preserve">На сложном тест-сете, +27.11 % vs base</w:t>
+              <w:t xml:space="preserve">Косинусная модель + российские бонусы</w:t>
             </w:r>
           </w:p>
         </w:tc>
@@ -722,7 +754,7 @@
                 <w:sz w:val="20"/>
                 <w:szCs w:val="20"/>
               </w:rPr>
-              <w:t xml:space="preserve">Coverage</w:t>
+              <w:t xml:space="preserve">NDCG@10 (чистые)</w:t>
             </w:r>
           </w:p>
         </w:tc>
@@ -754,7 +786,7 @@
                 <w:sz w:val="20"/>
                 <w:szCs w:val="20"/>
               </w:rPr>
-              <w:t xml:space="preserve">87.4 %</w:t>
+              <w:t xml:space="preserve">0.7820</w:t>
             </w:r>
           </w:p>
         </w:tc>
@@ -786,7 +818,7 @@
                 <w:sz w:val="20"/>
                 <w:szCs w:val="20"/>
               </w:rPr>
-              <w:t xml:space="preserve">76 из 87 стран попадают в рекомендации</w:t>
+              <w:t xml:space="preserve">Профили без шума</w:t>
             </w:r>
           </w:p>
         </w:tc>
@@ -819,7 +851,7 @@
                 <w:sz w:val="20"/>
                 <w:szCs w:val="20"/>
               </w:rPr>
-              <w:t xml:space="preserve">Diversity@10</w:t>
+              <w:t xml:space="preserve">NDCG@10 (российские)</w:t>
             </w:r>
           </w:p>
         </w:tc>
@@ -850,7 +882,7 @@
                 <w:sz w:val="20"/>
                 <w:szCs w:val="20"/>
               </w:rPr>
-              <w:t xml:space="preserve">0.046</w:t>
+              <w:t xml:space="preserve">0.7368</w:t>
             </w:r>
           </w:p>
         </w:tc>
@@ -881,7 +913,7 @@
                 <w:sz w:val="20"/>
                 <w:szCs w:val="20"/>
               </w:rPr>
-              <w:t xml:space="preserve">Умеренная разнородность</w:t>
+              <w:t xml:space="preserve">Профили с user_is_russian=True</w:t>
             </w:r>
           </w:p>
         </w:tc>
@@ -915,7 +947,7 @@
                 <w:sz w:val="20"/>
                 <w:szCs w:val="20"/>
               </w:rPr>
-              <w:t xml:space="preserve">Стран в датасете</w:t>
+              <w:t xml:space="preserve">NDCG@10 LinUCB</w:t>
             </w:r>
           </w:p>
         </w:tc>
@@ -947,7 +979,7 @@
                 <w:sz w:val="20"/>
                 <w:szCs w:val="20"/>
               </w:rPr>
-              <w:t xml:space="preserve">87</w:t>
+              <w:t xml:space="preserve">0.3491*</w:t>
             </w:r>
           </w:p>
         </w:tc>
@@ -979,7 +1011,7 @@
                 <w:sz w:val="20"/>
                 <w:szCs w:val="20"/>
               </w:rPr>
-              <w:t xml:space="preserve">Из 238 исходных (фильтр &gt;40% NA)</w:t>
+              <w:t xml:space="preserve">На сложном тест-сете, +27.11 % vs base</w:t>
             </w:r>
           </w:p>
         </w:tc>
@@ -1012,6 +1044,295 @@
                 <w:sz w:val="20"/>
                 <w:szCs w:val="20"/>
               </w:rPr>
+              <w:t xml:space="preserve">Coverage</w:t>
+            </w:r>
+          </w:p>
+        </w:tc>
+        <w:tc>
+          <w:tcPr>
+            <w:tcW w:type="dxa" w:w="2200"/>
+            <w:tcBorders>
+              <w:top w:val="single" w:color="CCCCCC" w:sz="4"/>
+              <w:left w:val="single" w:color="CCCCCC" w:sz="4"/>
+              <w:bottom w:val="single" w:color="CCCCCC" w:sz="4"/>
+              <w:right w:val="single" w:color="CCCCCC" w:sz="4"/>
+            </w:tcBorders>
+            <w:tcMar>
+              <w:top w:type="dxa" w:w="80"/>
+              <w:left w:type="dxa" w:w="120"/>
+              <w:bottom w:type="dxa" w:w="80"/>
+              <w:right w:type="dxa" w:w="120"/>
+            </w:tcMar>
+          </w:tcPr>
+          <w:p>
+            <w:pPr>
+              <w:jc w:val="center"/>
+            </w:pPr>
+            <w:r>
+              <w:rPr>
+                <w:rFonts w:ascii="Calibri" w:cs="Calibri" w:eastAsia="Calibri" w:hAnsi="Calibri"/>
+                <w:color w:val="000000"/>
+                <w:sz w:val="20"/>
+                <w:szCs w:val="20"/>
+              </w:rPr>
+              <w:t xml:space="preserve">85.2 %</w:t>
+            </w:r>
+          </w:p>
+        </w:tc>
+        <w:tc>
+          <w:tcPr>
+            <w:tcW w:type="dxa" w:w="4000"/>
+            <w:tcBorders>
+              <w:top w:val="single" w:color="CCCCCC" w:sz="4"/>
+              <w:left w:val="single" w:color="CCCCCC" w:sz="4"/>
+              <w:bottom w:val="single" w:color="CCCCCC" w:sz="4"/>
+              <w:right w:val="single" w:color="CCCCCC" w:sz="4"/>
+            </w:tcBorders>
+            <w:tcMar>
+              <w:top w:type="dxa" w:w="80"/>
+              <w:left w:type="dxa" w:w="120"/>
+              <w:bottom w:type="dxa" w:w="80"/>
+              <w:right w:type="dxa" w:w="120"/>
+            </w:tcMar>
+          </w:tcPr>
+          <w:p>
+            <w:pPr>
+              <w:jc w:val="center"/>
+            </w:pPr>
+            <w:r>
+              <w:rPr>
+                <w:rFonts w:ascii="Calibri" w:cs="Calibri" w:eastAsia="Calibri" w:hAnsi="Calibri"/>
+                <w:color w:val="000000"/>
+                <w:sz w:val="20"/>
+                <w:szCs w:val="20"/>
+              </w:rPr>
+              <w:t xml:space="preserve">75 из 88 стран попадают в рекомендации</w:t>
+            </w:r>
+          </w:p>
+        </w:tc>
+      </w:tr>
+      <w:tr>
+        <w:tc>
+          <w:tcPr>
+            <w:tcW w:type="dxa" w:w="3200"/>
+            <w:tcBorders>
+              <w:top w:val="single" w:color="CCCCCC" w:sz="4"/>
+              <w:left w:val="single" w:color="CCCCCC" w:sz="4"/>
+              <w:bottom w:val="single" w:color="CCCCCC" w:sz="4"/>
+              <w:right w:val="single" w:color="CCCCCC" w:sz="4"/>
+            </w:tcBorders>
+            <w:shd w:fill="D5E8F0" w:val="clear"/>
+            <w:tcMar>
+              <w:top w:type="dxa" w:w="80"/>
+              <w:left w:type="dxa" w:w="120"/>
+              <w:bottom w:type="dxa" w:w="80"/>
+              <w:right w:type="dxa" w:w="120"/>
+            </w:tcMar>
+          </w:tcPr>
+          <w:p>
+            <w:pPr>
+              <w:jc w:val="left"/>
+            </w:pPr>
+            <w:r>
+              <w:rPr>
+                <w:rFonts w:ascii="Calibri" w:cs="Calibri" w:eastAsia="Calibri" w:hAnsi="Calibri"/>
+                <w:color w:val="000000"/>
+                <w:sz w:val="20"/>
+                <w:szCs w:val="20"/>
+              </w:rPr>
+              <w:t xml:space="preserve">Diversity@10</w:t>
+            </w:r>
+          </w:p>
+        </w:tc>
+        <w:tc>
+          <w:tcPr>
+            <w:tcW w:type="dxa" w:w="2200"/>
+            <w:tcBorders>
+              <w:top w:val="single" w:color="CCCCCC" w:sz="4"/>
+              <w:left w:val="single" w:color="CCCCCC" w:sz="4"/>
+              <w:bottom w:val="single" w:color="CCCCCC" w:sz="4"/>
+              <w:right w:val="single" w:color="CCCCCC" w:sz="4"/>
+            </w:tcBorders>
+            <w:shd w:fill="D5E8F0" w:val="clear"/>
+            <w:tcMar>
+              <w:top w:type="dxa" w:w="80"/>
+              <w:left w:type="dxa" w:w="120"/>
+              <w:bottom w:type="dxa" w:w="80"/>
+              <w:right w:type="dxa" w:w="120"/>
+            </w:tcMar>
+          </w:tcPr>
+          <w:p>
+            <w:pPr>
+              <w:jc w:val="center"/>
+            </w:pPr>
+            <w:r>
+              <w:rPr>
+                <w:rFonts w:ascii="Calibri" w:cs="Calibri" w:eastAsia="Calibri" w:hAnsi="Calibri"/>
+                <w:color w:val="000000"/>
+                <w:sz w:val="20"/>
+                <w:szCs w:val="20"/>
+              </w:rPr>
+              <w:t xml:space="preserve">0.051</w:t>
+            </w:r>
+          </w:p>
+        </w:tc>
+        <w:tc>
+          <w:tcPr>
+            <w:tcW w:type="dxa" w:w="4000"/>
+            <w:tcBorders>
+              <w:top w:val="single" w:color="CCCCCC" w:sz="4"/>
+              <w:left w:val="single" w:color="CCCCCC" w:sz="4"/>
+              <w:bottom w:val="single" w:color="CCCCCC" w:sz="4"/>
+              <w:right w:val="single" w:color="CCCCCC" w:sz="4"/>
+            </w:tcBorders>
+            <w:shd w:fill="D5E8F0" w:val="clear"/>
+            <w:tcMar>
+              <w:top w:type="dxa" w:w="80"/>
+              <w:left w:type="dxa" w:w="120"/>
+              <w:bottom w:type="dxa" w:w="80"/>
+              <w:right w:type="dxa" w:w="120"/>
+            </w:tcMar>
+          </w:tcPr>
+          <w:p>
+            <w:pPr>
+              <w:jc w:val="center"/>
+            </w:pPr>
+            <w:r>
+              <w:rPr>
+                <w:rFonts w:ascii="Calibri" w:cs="Calibri" w:eastAsia="Calibri" w:hAnsi="Calibri"/>
+                <w:color w:val="000000"/>
+                <w:sz w:val="20"/>
+                <w:szCs w:val="20"/>
+              </w:rPr>
+              <w:t xml:space="preserve">Умеренная разнородность</w:t>
+            </w:r>
+          </w:p>
+        </w:tc>
+      </w:tr>
+      <w:tr>
+        <w:tc>
+          <w:tcPr>
+            <w:tcW w:type="dxa" w:w="3200"/>
+            <w:tcBorders>
+              <w:top w:val="single" w:color="CCCCCC" w:sz="4"/>
+              <w:left w:val="single" w:color="CCCCCC" w:sz="4"/>
+              <w:bottom w:val="single" w:color="CCCCCC" w:sz="4"/>
+              <w:right w:val="single" w:color="CCCCCC" w:sz="4"/>
+            </w:tcBorders>
+            <w:tcMar>
+              <w:top w:type="dxa" w:w="80"/>
+              <w:left w:type="dxa" w:w="120"/>
+              <w:bottom w:type="dxa" w:w="80"/>
+              <w:right w:type="dxa" w:w="120"/>
+            </w:tcMar>
+          </w:tcPr>
+          <w:p>
+            <w:pPr>
+              <w:jc w:val="left"/>
+            </w:pPr>
+            <w:r>
+              <w:rPr>
+                <w:rFonts w:ascii="Calibri" w:cs="Calibri" w:eastAsia="Calibri" w:hAnsi="Calibri"/>
+                <w:color w:val="000000"/>
+                <w:sz w:val="20"/>
+                <w:szCs w:val="20"/>
+              </w:rPr>
+              <w:t xml:space="preserve">Стран в датасете</w:t>
+            </w:r>
+          </w:p>
+        </w:tc>
+        <w:tc>
+          <w:tcPr>
+            <w:tcW w:type="dxa" w:w="2200"/>
+            <w:tcBorders>
+              <w:top w:val="single" w:color="CCCCCC" w:sz="4"/>
+              <w:left w:val="single" w:color="CCCCCC" w:sz="4"/>
+              <w:bottom w:val="single" w:color="CCCCCC" w:sz="4"/>
+              <w:right w:val="single" w:color="CCCCCC" w:sz="4"/>
+            </w:tcBorders>
+            <w:tcMar>
+              <w:top w:type="dxa" w:w="80"/>
+              <w:left w:type="dxa" w:w="120"/>
+              <w:bottom w:type="dxa" w:w="80"/>
+              <w:right w:type="dxa" w:w="120"/>
+            </w:tcMar>
+          </w:tcPr>
+          <w:p>
+            <w:pPr>
+              <w:jc w:val="center"/>
+            </w:pPr>
+            <w:r>
+              <w:rPr>
+                <w:rFonts w:ascii="Calibri" w:cs="Calibri" w:eastAsia="Calibri" w:hAnsi="Calibri"/>
+                <w:color w:val="000000"/>
+                <w:sz w:val="20"/>
+                <w:szCs w:val="20"/>
+              </w:rPr>
+              <w:t xml:space="preserve">88</w:t>
+            </w:r>
+          </w:p>
+        </w:tc>
+        <w:tc>
+          <w:tcPr>
+            <w:tcW w:type="dxa" w:w="4000"/>
+            <w:tcBorders>
+              <w:top w:val="single" w:color="CCCCCC" w:sz="4"/>
+              <w:left w:val="single" w:color="CCCCCC" w:sz="4"/>
+              <w:bottom w:val="single" w:color="CCCCCC" w:sz="4"/>
+              <w:right w:val="single" w:color="CCCCCC" w:sz="4"/>
+            </w:tcBorders>
+            <w:tcMar>
+              <w:top w:type="dxa" w:w="80"/>
+              <w:left w:type="dxa" w:w="120"/>
+              <w:bottom w:type="dxa" w:w="80"/>
+              <w:right w:type="dxa" w:w="120"/>
+            </w:tcMar>
+          </w:tcPr>
+          <w:p>
+            <w:pPr>
+              <w:jc w:val="center"/>
+            </w:pPr>
+            <w:r>
+              <w:rPr>
+                <w:rFonts w:ascii="Calibri" w:cs="Calibri" w:eastAsia="Calibri" w:hAnsi="Calibri"/>
+                <w:color w:val="000000"/>
+                <w:sz w:val="20"/>
+                <w:szCs w:val="20"/>
+              </w:rPr>
+              <w:t xml:space="preserve">Из 238 исходных (фильтр &gt;40% NA)</w:t>
+            </w:r>
+          </w:p>
+        </w:tc>
+      </w:tr>
+      <w:tr>
+        <w:tc>
+          <w:tcPr>
+            <w:tcW w:type="dxa" w:w="3200"/>
+            <w:tcBorders>
+              <w:top w:val="single" w:color="CCCCCC" w:sz="4"/>
+              <w:left w:val="single" w:color="CCCCCC" w:sz="4"/>
+              <w:bottom w:val="single" w:color="CCCCCC" w:sz="4"/>
+              <w:right w:val="single" w:color="CCCCCC" w:sz="4"/>
+            </w:tcBorders>
+            <w:shd w:fill="D5E8F0" w:val="clear"/>
+            <w:tcMar>
+              <w:top w:type="dxa" w:w="80"/>
+              <w:left w:type="dxa" w:w="120"/>
+              <w:bottom w:type="dxa" w:w="80"/>
+              <w:right w:type="dxa" w:w="120"/>
+            </w:tcMar>
+          </w:tcPr>
+          <w:p>
+            <w:pPr>
+              <w:jc w:val="left"/>
+            </w:pPr>
+            <w:r>
+              <w:rPr>
+                <w:rFonts w:ascii="Calibri" w:cs="Calibri" w:eastAsia="Calibri" w:hAnsi="Calibri"/>
+                <w:color w:val="000000"/>
+                <w:sz w:val="20"/>
+                <w:szCs w:val="20"/>
+              </w:rPr>
               <w:t xml:space="preserve">Признаков</w:t>
             </w:r>
           </w:p>
@@ -1025,25 +1346,26 @@
               <w:bottom w:val="single" w:color="CCCCCC" w:sz="4"/>
               <w:right w:val="single" w:color="CCCCCC" w:sz="4"/>
             </w:tcBorders>
-            <w:tcMar>
-              <w:top w:type="dxa" w:w="80"/>
-              <w:left w:type="dxa" w:w="120"/>
-              <w:bottom w:type="dxa" w:w="80"/>
-              <w:right w:type="dxa" w:w="120"/>
-            </w:tcMar>
-          </w:tcPr>
-          <w:p>
-            <w:pPr>
-              <w:jc w:val="center"/>
-            </w:pPr>
-            <w:r>
-              <w:rPr>
-                <w:rFonts w:ascii="Calibri" w:cs="Calibri" w:eastAsia="Calibri" w:hAnsi="Calibri"/>
-                <w:color w:val="000000"/>
-                <w:sz w:val="20"/>
-                <w:szCs w:val="20"/>
-              </w:rPr>
-              <w:t xml:space="preserve">20</w:t>
+            <w:shd w:fill="D5E8F0" w:val="clear"/>
+            <w:tcMar>
+              <w:top w:type="dxa" w:w="80"/>
+              <w:left w:type="dxa" w:w="120"/>
+              <w:bottom w:type="dxa" w:w="80"/>
+              <w:right w:type="dxa" w:w="120"/>
+            </w:tcMar>
+          </w:tcPr>
+          <w:p>
+            <w:pPr>
+              <w:jc w:val="center"/>
+            </w:pPr>
+            <w:r>
+              <w:rPr>
+                <w:rFonts w:ascii="Calibri" w:cs="Calibri" w:eastAsia="Calibri" w:hAnsi="Calibri"/>
+                <w:color w:val="000000"/>
+                <w:sz w:val="20"/>
+                <w:szCs w:val="20"/>
+              </w:rPr>
+              <w:t xml:space="preserve">23</w:t>
             </w:r>
           </w:p>
         </w:tc>
@@ -1056,25 +1378,26 @@
               <w:bottom w:val="single" w:color="CCCCCC" w:sz="4"/>
               <w:right w:val="single" w:color="CCCCCC" w:sz="4"/>
             </w:tcBorders>
-            <w:tcMar>
-              <w:top w:type="dxa" w:w="80"/>
-              <w:left w:type="dxa" w:w="120"/>
-              <w:bottom w:type="dxa" w:w="80"/>
-              <w:right w:type="dxa" w:w="120"/>
-            </w:tcMar>
-          </w:tcPr>
-          <w:p>
-            <w:pPr>
-              <w:jc w:val="center"/>
-            </w:pPr>
-            <w:r>
-              <w:rPr>
-                <w:rFonts w:ascii="Calibri" w:cs="Calibri" w:eastAsia="Calibri" w:hAnsi="Calibri"/>
-                <w:color w:val="000000"/>
-                <w:sz w:val="20"/>
-                <w:szCs w:val="20"/>
-              </w:rPr>
-              <w:t xml:space="preserve">После MinMax-нормализации</w:t>
+            <w:shd w:fill="D5E8F0" w:val="clear"/>
+            <w:tcMar>
+              <w:top w:type="dxa" w:w="80"/>
+              <w:left w:type="dxa" w:w="120"/>
+              <w:bottom w:type="dxa" w:w="80"/>
+              <w:right w:type="dxa" w:w="120"/>
+            </w:tcMar>
+          </w:tcPr>
+          <w:p>
+            <w:pPr>
+              <w:jc w:val="center"/>
+            </w:pPr>
+            <w:r>
+              <w:rPr>
+                <w:rFonts w:ascii="Calibri" w:cs="Calibri" w:eastAsia="Calibri" w:hAnsi="Calibri"/>
+                <w:color w:val="000000"/>
+                <w:sz w:val="20"/>
+                <w:szCs w:val="20"/>
+              </w:rPr>
+              <w:t xml:space="preserve">После MinMax-нормализации, вкл. 3 Russian-specific</w:t>
             </w:r>
           </w:p>
         </w:tc>
@@ -1101,7 +1424,7 @@
           <w:sz w:val="20"/>
           <w:szCs w:val="20"/>
         </w:rPr>
-        <w:t xml:space="preserve">* Тест-сет в evaluate.py и rl_agent.py разный (50 vs 200 профилей, разные распределения); ниже разбираем подробнее.</w:t>
+        <w:t xml:space="preserve">* Тест-сет в evaluate.py и rl_agent.py разный (59 vs 200 профилей, разные распределения); ниже разбираем подробнее.</w:t>
       </w:r>
     </w:p>
     <w:p>
@@ -2684,6 +3007,461 @@
     </w:p>
     <w:p>
       <w:pPr>
+        <w:pStyle w:val="Heading3"/>
+        <w:spacing w:after="80" w:before="180"/>
+      </w:pPr>
+      <w:r>
+        <w:rPr>
+          <w:rFonts w:ascii="Calibri" w:cs="Calibri" w:eastAsia="Calibri" w:hAnsi="Calibri"/>
+          <w:b/>
+          <w:bCs/>
+          <w:color w:val="2F5496"/>
+          <w:sz w:val="24"/>
+          <w:szCs w:val="24"/>
+        </w:rPr>
+        <w:t xml:space="preserve">Три дополнительных колонки для россиян</w:t>
+      </w:r>
+    </w:p>
+    <w:p>
+      <w:pPr>
+        <w:spacing w:after="120" w:line="300"/>
+        <w:jc w:val="left"/>
+      </w:pPr>
+      <w:r>
+        <w:rPr>
+          <w:rFonts w:ascii="Calibri" w:cs="Calibri" w:eastAsia="Calibri" w:hAnsi="Calibri"/>
+          <w:sz w:val="22"/>
+          <w:szCs w:val="22"/>
+        </w:rPr>
+        <w:t xml:space="preserve">В visa_data добавлены три признака, специфичных для граждан РФ:</w:t>
+      </w:r>
+    </w:p>
+    <w:tbl>
+      <w:tblPr>
+        <w:tblW w:type="dxa" w:w="9400"/>
+        <w:tblBorders>
+          <w:top w:val="single" w:color="auto" w:sz="4"/>
+          <w:left w:val="single" w:color="auto" w:sz="4"/>
+          <w:bottom w:val="single" w:color="auto" w:sz="4"/>
+          <w:right w:val="single" w:color="auto" w:sz="4"/>
+          <w:insideH w:val="single" w:color="auto" w:sz="4"/>
+          <w:insideV w:val="single" w:color="auto" w:sz="4"/>
+        </w:tblBorders>
+      </w:tblPr>
+      <w:tblGrid>
+        <w:gridCol w:w="2800"/>
+        <w:gridCol w:w="1200"/>
+        <w:gridCol w:w="5400"/>
+      </w:tblGrid>
+      <w:tr>
+        <w:tc>
+          <w:tcPr>
+            <w:tcW w:type="dxa" w:w="2800"/>
+            <w:tcBorders>
+              <w:top w:val="single" w:color="CCCCCC" w:sz="4"/>
+              <w:left w:val="single" w:color="CCCCCC" w:sz="4"/>
+              <w:bottom w:val="single" w:color="CCCCCC" w:sz="4"/>
+              <w:right w:val="single" w:color="CCCCCC" w:sz="4"/>
+            </w:tcBorders>
+            <w:shd w:fill="1F4E79" w:val="clear"/>
+            <w:tcMar>
+              <w:top w:type="dxa" w:w="80"/>
+              <w:left w:type="dxa" w:w="120"/>
+              <w:bottom w:type="dxa" w:w="80"/>
+              <w:right w:type="dxa" w:w="120"/>
+            </w:tcMar>
+          </w:tcPr>
+          <w:p>
+            <w:pPr>
+              <w:jc w:val="left"/>
+            </w:pPr>
+            <w:r>
+              <w:rPr>
+                <w:rFonts w:ascii="Calibri" w:cs="Calibri" w:eastAsia="Calibri" w:hAnsi="Calibri"/>
+                <w:b/>
+                <w:bCs/>
+                <w:color w:val="FFFFFF"/>
+                <w:sz w:val="20"/>
+                <w:szCs w:val="20"/>
+              </w:rPr>
+              <w:t xml:space="preserve">Колонка</w:t>
+            </w:r>
+          </w:p>
+        </w:tc>
+        <w:tc>
+          <w:tcPr>
+            <w:tcW w:type="dxa" w:w="1200"/>
+            <w:tcBorders>
+              <w:top w:val="single" w:color="CCCCCC" w:sz="4"/>
+              <w:left w:val="single" w:color="CCCCCC" w:sz="4"/>
+              <w:bottom w:val="single" w:color="CCCCCC" w:sz="4"/>
+              <w:right w:val="single" w:color="CCCCCC" w:sz="4"/>
+            </w:tcBorders>
+            <w:shd w:fill="1F4E79" w:val="clear"/>
+            <w:tcMar>
+              <w:top w:type="dxa" w:w="80"/>
+              <w:left w:type="dxa" w:w="120"/>
+              <w:bottom w:type="dxa" w:w="80"/>
+              <w:right w:type="dxa" w:w="120"/>
+            </w:tcMar>
+          </w:tcPr>
+          <w:p>
+            <w:pPr>
+              <w:jc w:val="center"/>
+            </w:pPr>
+            <w:r>
+              <w:rPr>
+                <w:rFonts w:ascii="Calibri" w:cs="Calibri" w:eastAsia="Calibri" w:hAnsi="Calibri"/>
+                <w:b/>
+                <w:bCs/>
+                <w:color w:val="FFFFFF"/>
+                <w:sz w:val="20"/>
+                <w:szCs w:val="20"/>
+              </w:rPr>
+              <w:t xml:space="preserve">Тип</w:t>
+            </w:r>
+          </w:p>
+        </w:tc>
+        <w:tc>
+          <w:tcPr>
+            <w:tcW w:type="dxa" w:w="5400"/>
+            <w:tcBorders>
+              <w:top w:val="single" w:color="CCCCCC" w:sz="4"/>
+              <w:left w:val="single" w:color="CCCCCC" w:sz="4"/>
+              <w:bottom w:val="single" w:color="CCCCCC" w:sz="4"/>
+              <w:right w:val="single" w:color="CCCCCC" w:sz="4"/>
+            </w:tcBorders>
+            <w:shd w:fill="1F4E79" w:val="clear"/>
+            <w:tcMar>
+              <w:top w:type="dxa" w:w="80"/>
+              <w:left w:type="dxa" w:w="120"/>
+              <w:bottom w:type="dxa" w:w="80"/>
+              <w:right w:type="dxa" w:w="120"/>
+            </w:tcMar>
+          </w:tcPr>
+          <w:p>
+            <w:pPr>
+              <w:jc w:val="center"/>
+            </w:pPr>
+            <w:r>
+              <w:rPr>
+                <w:rFonts w:ascii="Calibri" w:cs="Calibri" w:eastAsia="Calibri" w:hAnsi="Calibri"/>
+                <w:b/>
+                <w:bCs/>
+                <w:color w:val="FFFFFF"/>
+                <w:sz w:val="20"/>
+                <w:szCs w:val="20"/>
+              </w:rPr>
+              <w:t xml:space="preserve">Описание</w:t>
+            </w:r>
+          </w:p>
+        </w:tc>
+      </w:tr>
+      <w:tr>
+        <w:tc>
+          <w:tcPr>
+            <w:tcW w:type="dxa" w:w="2800"/>
+            <w:tcBorders>
+              <w:top w:val="single" w:color="CCCCCC" w:sz="4"/>
+              <w:left w:val="single" w:color="CCCCCC" w:sz="4"/>
+              <w:bottom w:val="single" w:color="CCCCCC" w:sz="4"/>
+              <w:right w:val="single" w:color="CCCCCC" w:sz="4"/>
+            </w:tcBorders>
+            <w:tcMar>
+              <w:top w:type="dxa" w:w="80"/>
+              <w:left w:type="dxa" w:w="120"/>
+              <w:bottom w:type="dxa" w:w="80"/>
+              <w:right w:type="dxa" w:w="120"/>
+            </w:tcMar>
+          </w:tcPr>
+          <w:p>
+            <w:pPr>
+              <w:jc w:val="left"/>
+            </w:pPr>
+            <w:r>
+              <w:rPr>
+                <w:rFonts w:ascii="Calibri" w:cs="Calibri" w:eastAsia="Calibri" w:hAnsi="Calibri"/>
+                <w:color w:val="000000"/>
+                <w:sz w:val="20"/>
+                <w:szCs w:val="20"/>
+              </w:rPr>
+              <w:t xml:space="preserve">ru_visa_free</w:t>
+            </w:r>
+          </w:p>
+        </w:tc>
+        <w:tc>
+          <w:tcPr>
+            <w:tcW w:type="dxa" w:w="1200"/>
+            <w:tcBorders>
+              <w:top w:val="single" w:color="CCCCCC" w:sz="4"/>
+              <w:left w:val="single" w:color="CCCCCC" w:sz="4"/>
+              <w:bottom w:val="single" w:color="CCCCCC" w:sz="4"/>
+              <w:right w:val="single" w:color="CCCCCC" w:sz="4"/>
+            </w:tcBorders>
+            <w:tcMar>
+              <w:top w:type="dxa" w:w="80"/>
+              <w:left w:type="dxa" w:w="120"/>
+              <w:bottom w:type="dxa" w:w="80"/>
+              <w:right w:type="dxa" w:w="120"/>
+            </w:tcMar>
+          </w:tcPr>
+          <w:p>
+            <w:pPr>
+              <w:jc w:val="center"/>
+            </w:pPr>
+            <w:r>
+              <w:rPr>
+                <w:rFonts w:ascii="Calibri" w:cs="Calibri" w:eastAsia="Calibri" w:hAnsi="Calibri"/>
+                <w:color w:val="000000"/>
+                <w:sz w:val="20"/>
+                <w:szCs w:val="20"/>
+              </w:rPr>
+              <w:t xml:space="preserve">bool</w:t>
+            </w:r>
+          </w:p>
+        </w:tc>
+        <w:tc>
+          <w:tcPr>
+            <w:tcW w:type="dxa" w:w="5400"/>
+            <w:tcBorders>
+              <w:top w:val="single" w:color="CCCCCC" w:sz="4"/>
+              <w:left w:val="single" w:color="CCCCCC" w:sz="4"/>
+              <w:bottom w:val="single" w:color="CCCCCC" w:sz="4"/>
+              <w:right w:val="single" w:color="CCCCCC" w:sz="4"/>
+            </w:tcBorders>
+            <w:tcMar>
+              <w:top w:type="dxa" w:w="80"/>
+              <w:left w:type="dxa" w:w="120"/>
+              <w:bottom w:type="dxa" w:w="80"/>
+              <w:right w:type="dxa" w:w="120"/>
+            </w:tcMar>
+          </w:tcPr>
+          <w:p>
+            <w:pPr>
+              <w:jc w:val="center"/>
+            </w:pPr>
+            <w:r>
+              <w:rPr>
+                <w:rFonts w:ascii="Calibri" w:cs="Calibri" w:eastAsia="Calibri" w:hAnsi="Calibri"/>
+                <w:color w:val="000000"/>
+                <w:sz w:val="20"/>
+                <w:szCs w:val="20"/>
+              </w:rPr>
+              <w:t xml:space="preserve">Безвизовый въезд / visa-on-arrival с паспортом РФ (по состоянию на 2025)</w:t>
+            </w:r>
+          </w:p>
+        </w:tc>
+      </w:tr>
+      <w:tr>
+        <w:tc>
+          <w:tcPr>
+            <w:tcW w:type="dxa" w:w="2800"/>
+            <w:tcBorders>
+              <w:top w:val="single" w:color="CCCCCC" w:sz="4"/>
+              <w:left w:val="single" w:color="CCCCCC" w:sz="4"/>
+              <w:bottom w:val="single" w:color="CCCCCC" w:sz="4"/>
+              <w:right w:val="single" w:color="CCCCCC" w:sz="4"/>
+            </w:tcBorders>
+            <w:shd w:fill="D5E8F0" w:val="clear"/>
+            <w:tcMar>
+              <w:top w:type="dxa" w:w="80"/>
+              <w:left w:type="dxa" w:w="120"/>
+              <w:bottom w:type="dxa" w:w="80"/>
+              <w:right w:type="dxa" w:w="120"/>
+            </w:tcMar>
+          </w:tcPr>
+          <w:p>
+            <w:pPr>
+              <w:jc w:val="left"/>
+            </w:pPr>
+            <w:r>
+              <w:rPr>
+                <w:rFonts w:ascii="Calibri" w:cs="Calibri" w:eastAsia="Calibri" w:hAnsi="Calibri"/>
+                <w:color w:val="000000"/>
+                <w:sz w:val="20"/>
+                <w:szCs w:val="20"/>
+              </w:rPr>
+              <w:t xml:space="preserve">ru_banking_access</w:t>
+            </w:r>
+          </w:p>
+        </w:tc>
+        <w:tc>
+          <w:tcPr>
+            <w:tcW w:type="dxa" w:w="1200"/>
+            <w:tcBorders>
+              <w:top w:val="single" w:color="CCCCCC" w:sz="4"/>
+              <w:left w:val="single" w:color="CCCCCC" w:sz="4"/>
+              <w:bottom w:val="single" w:color="CCCCCC" w:sz="4"/>
+              <w:right w:val="single" w:color="CCCCCC" w:sz="4"/>
+            </w:tcBorders>
+            <w:shd w:fill="D5E8F0" w:val="clear"/>
+            <w:tcMar>
+              <w:top w:type="dxa" w:w="80"/>
+              <w:left w:type="dxa" w:w="120"/>
+              <w:bottom w:type="dxa" w:w="80"/>
+              <w:right w:type="dxa" w:w="120"/>
+            </w:tcMar>
+          </w:tcPr>
+          <w:p>
+            <w:pPr>
+              <w:jc w:val="center"/>
+            </w:pPr>
+            <w:r>
+              <w:rPr>
+                <w:rFonts w:ascii="Calibri" w:cs="Calibri" w:eastAsia="Calibri" w:hAnsi="Calibri"/>
+                <w:color w:val="000000"/>
+                <w:sz w:val="20"/>
+                <w:szCs w:val="20"/>
+              </w:rPr>
+              <w:t xml:space="preserve">1–5</w:t>
+            </w:r>
+          </w:p>
+        </w:tc>
+        <w:tc>
+          <w:tcPr>
+            <w:tcW w:type="dxa" w:w="5400"/>
+            <w:tcBorders>
+              <w:top w:val="single" w:color="CCCCCC" w:sz="4"/>
+              <w:left w:val="single" w:color="CCCCCC" w:sz="4"/>
+              <w:bottom w:val="single" w:color="CCCCCC" w:sz="4"/>
+              <w:right w:val="single" w:color="CCCCCC" w:sz="4"/>
+            </w:tcBorders>
+            <w:shd w:fill="D5E8F0" w:val="clear"/>
+            <w:tcMar>
+              <w:top w:type="dxa" w:w="80"/>
+              <w:left w:type="dxa" w:w="120"/>
+              <w:bottom w:type="dxa" w:w="80"/>
+              <w:right w:type="dxa" w:w="120"/>
+            </w:tcMar>
+          </w:tcPr>
+          <w:p>
+            <w:pPr>
+              <w:jc w:val="center"/>
+            </w:pPr>
+            <w:r>
+              <w:rPr>
+                <w:rFonts w:ascii="Calibri" w:cs="Calibri" w:eastAsia="Calibri" w:hAnsi="Calibri"/>
+                <w:color w:val="000000"/>
+                <w:sz w:val="20"/>
+                <w:szCs w:val="20"/>
+              </w:rPr>
+              <w:t xml:space="preserve">Доступность банковского обслуживания: 5 = легко открыть счёт (ARM, GEO, SRB), 1 = практически невозможно (USA, CHE, страны Балтии)</w:t>
+            </w:r>
+          </w:p>
+        </w:tc>
+      </w:tr>
+      <w:tr>
+        <w:tc>
+          <w:tcPr>
+            <w:tcW w:type="dxa" w:w="2800"/>
+            <w:tcBorders>
+              <w:top w:val="single" w:color="CCCCCC" w:sz="4"/>
+              <w:left w:val="single" w:color="CCCCCC" w:sz="4"/>
+              <w:bottom w:val="single" w:color="CCCCCC" w:sz="4"/>
+              <w:right w:val="single" w:color="CCCCCC" w:sz="4"/>
+            </w:tcBorders>
+            <w:tcMar>
+              <w:top w:type="dxa" w:w="80"/>
+              <w:left w:type="dxa" w:w="120"/>
+              <w:bottom w:type="dxa" w:w="80"/>
+              <w:right w:type="dxa" w:w="120"/>
+            </w:tcMar>
+          </w:tcPr>
+          <w:p>
+            <w:pPr>
+              <w:jc w:val="left"/>
+            </w:pPr>
+            <w:r>
+              <w:rPr>
+                <w:rFonts w:ascii="Calibri" w:cs="Calibri" w:eastAsia="Calibri" w:hAnsi="Calibri"/>
+                <w:color w:val="000000"/>
+                <w:sz w:val="20"/>
+                <w:szCs w:val="20"/>
+              </w:rPr>
+              <w:t xml:space="preserve">ru_sanctions_risk</w:t>
+            </w:r>
+          </w:p>
+        </w:tc>
+        <w:tc>
+          <w:tcPr>
+            <w:tcW w:type="dxa" w:w="1200"/>
+            <w:tcBorders>
+              <w:top w:val="single" w:color="CCCCCC" w:sz="4"/>
+              <w:left w:val="single" w:color="CCCCCC" w:sz="4"/>
+              <w:bottom w:val="single" w:color="CCCCCC" w:sz="4"/>
+              <w:right w:val="single" w:color="CCCCCC" w:sz="4"/>
+            </w:tcBorders>
+            <w:tcMar>
+              <w:top w:type="dxa" w:w="80"/>
+              <w:left w:type="dxa" w:w="120"/>
+              <w:bottom w:type="dxa" w:w="80"/>
+              <w:right w:type="dxa" w:w="120"/>
+            </w:tcMar>
+          </w:tcPr>
+          <w:p>
+            <w:pPr>
+              <w:jc w:val="center"/>
+            </w:pPr>
+            <w:r>
+              <w:rPr>
+                <w:rFonts w:ascii="Calibri" w:cs="Calibri" w:eastAsia="Calibri" w:hAnsi="Calibri"/>
+                <w:color w:val="000000"/>
+                <w:sz w:val="20"/>
+                <w:szCs w:val="20"/>
+              </w:rPr>
+              <w:t xml:space="preserve">1–3</w:t>
+            </w:r>
+          </w:p>
+        </w:tc>
+        <w:tc>
+          <w:tcPr>
+            <w:tcW w:type="dxa" w:w="5400"/>
+            <w:tcBorders>
+              <w:top w:val="single" w:color="CCCCCC" w:sz="4"/>
+              <w:left w:val="single" w:color="CCCCCC" w:sz="4"/>
+              <w:bottom w:val="single" w:color="CCCCCC" w:sz="4"/>
+              <w:right w:val="single" w:color="CCCCCC" w:sz="4"/>
+            </w:tcBorders>
+            <w:tcMar>
+              <w:top w:type="dxa" w:w="80"/>
+              <w:left w:type="dxa" w:w="120"/>
+              <w:bottom w:type="dxa" w:w="80"/>
+              <w:right w:type="dxa" w:w="120"/>
+            </w:tcMar>
+          </w:tcPr>
+          <w:p>
+            <w:pPr>
+              <w:jc w:val="center"/>
+            </w:pPr>
+            <w:r>
+              <w:rPr>
+                <w:rFonts w:ascii="Calibri" w:cs="Calibri" w:eastAsia="Calibri" w:hAnsi="Calibri"/>
+                <w:color w:val="000000"/>
+                <w:sz w:val="20"/>
+                <w:szCs w:val="20"/>
+              </w:rPr>
+              <w:t xml:space="preserve">Санкционный риск: 1 = нет ограничений (TUR, ARE, THA), 2 = частичные, 3 = полный пакет (EU, USA, GBR, AUS)</w:t>
+            </w:r>
+          </w:p>
+        </w:tc>
+      </w:tr>
+    </w:tbl>
+    <w:p>
+      <w:pPr>
+        <w:spacing w:after="120" w:line="300"/>
+        <w:jc w:val="left"/>
+      </w:pPr>
+      <w:r>
+        <w:rPr>
+          <w:rFonts w:ascii="Calibri" w:cs="Calibri" w:eastAsia="Calibri" w:hAnsi="Calibri"/>
+          <w:sz w:val="22"/>
+          <w:szCs w:val="22"/>
+        </w:rPr>
+        <w:t xml:space="preserve">Страны вне visa_data (не в списке 65) получают нейтральные дефолты в preprocessor.py: ru_visa_free=0, ru_banking_access=3, ru_sanctions_risk=1 — чтобы не попасть под фильтр &gt;40% NA.</w:t>
+      </w:r>
+    </w:p>
+    <w:p>
+      <w:pPr>
         <w:pStyle w:val="Heading2"/>
         <w:spacing w:after="120" w:before="240"/>
       </w:pPr>
@@ -3103,7 +3881,7 @@
                 <w:sz w:val="20"/>
                 <w:szCs w:val="20"/>
               </w:rPr>
-              <w:t xml:space="preserve">7</w:t>
+              <w:t xml:space="preserve">10 (вкл. 3 Russian-specific)</w:t>
             </w:r>
           </w:p>
         </w:tc>
@@ -3683,7 +4461,7 @@
                 <w:sz w:val="20"/>
                 <w:szCs w:val="20"/>
               </w:rPr>
-              <w:t xml:space="preserve">151</w:t>
+              <w:t xml:space="preserve">150</w:t>
             </w:r>
           </w:p>
         </w:tc>
@@ -3749,7 +4527,7 @@
                 <w:sz w:val="20"/>
                 <w:szCs w:val="20"/>
               </w:rPr>
-              <w:t xml:space="preserve">87</w:t>
+              <w:t xml:space="preserve">88</w:t>
             </w:r>
           </w:p>
         </w:tc>
@@ -3813,7 +4591,7 @@
                 <w:sz w:val="20"/>
                 <w:szCs w:val="20"/>
               </w:rPr>
-              <w:t xml:space="preserve">20</w:t>
+              <w:t xml:space="preserve">23</w:t>
             </w:r>
           </w:p>
         </w:tc>
@@ -3943,7 +4721,7 @@
                 <w:sz w:val="20"/>
                 <w:szCs w:val="20"/>
               </w:rPr>
-              <w:t xml:space="preserve">16</w:t>
+              <w:t xml:space="preserve">18</w:t>
             </w:r>
           </w:p>
         </w:tc>
@@ -4009,7 +4787,7 @@
                 <w:sz w:val="20"/>
                 <w:szCs w:val="20"/>
               </w:rPr>
-              <w:t xml:space="preserve">4</w:t>
+              <w:t xml:space="preserve">5 (вкл. ru_visa_free)</w:t>
             </w:r>
           </w:p>
         </w:tc>
@@ -4049,7 +4827,21 @@
           <w:sz w:val="22"/>
           <w:szCs w:val="22"/>
         </w:rPr>
-        <w:t xml:space="preserve">Порог 40% пропусков — компромисс. Меньше → теряем интересные страны (Iran, Bolivia). Больше → импутация слишком агрессивна. 40% даёт 87 стран — достаточно для кластеризации (~12 стран на кластер при K=7).</w:t>
+        <w:t xml:space="preserve">Порог 40% пропусков — компромисс. Меньше → теряем интересные страны (Iran, Bolivia). Больше → импутация слишком агрессивна. 40% даёт 88 стран — достаточно для кластеризации (~12 стран на кластер при K=7).</w:t>
+      </w:r>
+    </w:p>
+    <w:p>
+      <w:pPr>
+        <w:spacing w:after="120" w:line="300"/>
+        <w:jc w:val="left"/>
+      </w:pPr>
+      <w:r>
+        <w:rPr>
+          <w:rFonts w:ascii="Calibri" w:cs="Calibri" w:eastAsia="Calibri" w:hAnsi="Calibri"/>
+          <w:sz w:val="22"/>
+          <w:szCs w:val="22"/>
+        </w:rPr>
+        <w:t xml:space="preserve">Важная деталь: при добавлении трёх Russian-specific колонок страны, отсутствующие в visa_data (23 из 88), получали NaN по всем трём — это поднимало долю пропусков выше 40% и выбивало их из датасета. Решение: заполнять нейтральными дефолтами ещё до расчёта missing_rate (шаг 2b в build_dataset()).</w:t>
       </w:r>
     </w:p>
     <w:p>
@@ -6709,6 +7501,66 @@
     </w:p>
     <w:p>
       <w:pPr>
+        <w:shd w:fill="F2F2F2" w:val="clear"/>
+        <w:spacing w:after="0" w:line="260"/>
+      </w:pPr>
+      <w:r>
+        <w:rPr>
+          <w:rFonts w:ascii="Consolas" w:cs="Consolas" w:eastAsia="Consolas" w:hAnsi="Consolas"/>
+          <w:color w:val="1F2937"/>
+          <w:sz w:val="18"/>
+          <w:szCs w:val="18"/>
+        </w:rPr>
+        <w:t xml:space="preserve">    # Russian-specific fields</w:t>
+      </w:r>
+    </w:p>
+    <w:p>
+      <w:pPr>
+        <w:shd w:fill="F2F2F2" w:val="clear"/>
+        <w:spacing w:after="0" w:line="260"/>
+      </w:pPr>
+      <w:r>
+        <w:rPr>
+          <w:rFonts w:ascii="Consolas" w:cs="Consolas" w:eastAsia="Consolas" w:hAnsi="Consolas"/>
+          <w:color w:val="1F2937"/>
+          <w:sz w:val="18"/>
+          <w:szCs w:val="18"/>
+        </w:rPr>
+        <w:t xml:space="preserve">    user_is_russian:     bool = False  # включает RU-бонусы/штрафы</w:t>
+      </w:r>
+    </w:p>
+    <w:p>
+      <w:pPr>
+        <w:shd w:fill="F2F2F2" w:val="clear"/>
+        <w:spacing w:after="0" w:line="260"/>
+      </w:pPr>
+      <w:r>
+        <w:rPr>
+          <w:rFonts w:ascii="Consolas" w:cs="Consolas" w:eastAsia="Consolas" w:hAnsi="Consolas"/>
+          <w:color w:val="1F2937"/>
+          <w:sz w:val="18"/>
+          <w:szCs w:val="18"/>
+        </w:rPr>
+        <w:t xml:space="preserve">    needs_banking_access:bool = False  # нужен счёт в иностранном банке</w:t>
+      </w:r>
+    </w:p>
+    <w:p>
+      <w:pPr>
+        <w:shd w:fill="F2F2F2" w:val="clear"/>
+        <w:spacing w:after="0" w:line="260"/>
+      </w:pPr>
+      <w:r>
+        <w:rPr>
+          <w:rFonts w:ascii="Consolas" w:cs="Consolas" w:eastAsia="Consolas" w:hAnsi="Consolas"/>
+          <w:color w:val="1F2937"/>
+          <w:sz w:val="18"/>
+          <w:szCs w:val="18"/>
+        </w:rPr>
+        <w:t xml:space="preserve">    has_eu_visa:         bool = False  # есть действующая шенгенская виза</w:t>
+      </w:r>
+    </w:p>
+    <w:p>
+      <w:pPr>
         <w:spacing w:after="120" w:line="300"/>
         <w:jc w:val="left"/>
       </w:pPr>
@@ -6718,7 +7570,7 @@
           <w:sz w:val="22"/>
           <w:szCs w:val="22"/>
         </w:rPr>
-        <w:t xml:space="preserve">Валидация диапазона 1-5 происходит в __post_init__, языки нормализуются к нижнему регистру.</w:t>
+        <w:t xml:space="preserve">Валидация диапазона 1-5 происходит в __post_init__, языки нормализуются к нижнему регистру. Три новых поля включаются исключительно при user_is_russian=True и не влияют на стандартный расчёт.</w:t>
       </w:r>
     </w:p>
     <w:p>
@@ -6804,6 +7656,42 @@
           <w:szCs w:val="22"/>
         </w:rPr>
         <w:t xml:space="preserve">visa_easy_priority=3 → residency/DNV/eu_member умеренные</w:t>
+      </w:r>
+    </w:p>
+    <w:p>
+      <w:pPr>
+        <w:pStyle w:val="ListParagraph"/>
+        <w:numPr>
+          <w:ilvl w:val="0"/>
+          <w:numId w:val="2"/>
+        </w:numPr>
+        <w:spacing w:after="60"/>
+      </w:pPr>
+      <w:r>
+        <w:rPr>
+          <w:rFonts w:ascii="Calibri" w:cs="Calibri" w:eastAsia="Calibri" w:hAnsi="Calibri"/>
+          <w:sz w:val="22"/>
+          <w:szCs w:val="22"/>
+        </w:rPr>
+        <w:t xml:space="preserve">user_is_russian=True → ru_sanctions_risk weight = 1.8 (ключевой фактор)</w:t>
+      </w:r>
+    </w:p>
+    <w:p>
+      <w:pPr>
+        <w:pStyle w:val="ListParagraph"/>
+        <w:numPr>
+          <w:ilvl w:val="0"/>
+          <w:numId w:val="2"/>
+        </w:numPr>
+        <w:spacing w:after="60"/>
+      </w:pPr>
+      <w:r>
+        <w:rPr>
+          <w:rFonts w:ascii="Calibri" w:cs="Calibri" w:eastAsia="Calibri" w:hAnsi="Calibri"/>
+          <w:sz w:val="22"/>
+          <w:szCs w:val="22"/>
+        </w:rPr>
+        <w:t xml:space="preserve">needs_banking_access=True → ru_banking_access weight = 1.5</w:t>
       </w:r>
     </w:p>
     <w:p>
@@ -6850,13 +7738,13 @@
         </w:tblBorders>
       </w:tblPr>
       <w:tblGrid>
-        <w:gridCol w:w="3000"/>
-        <w:gridCol w:w="6400"/>
+        <w:gridCol w:w="2200"/>
+        <w:gridCol w:w="7200"/>
       </w:tblGrid>
       <w:tr>
         <w:tc>
           <w:tcPr>
-            <w:tcW w:type="dxa" w:w="3000"/>
+            <w:tcW w:type="dxa" w:w="2200"/>
             <w:tcBorders>
               <w:top w:val="single" w:color="CCCCCC" w:sz="4"/>
               <w:left w:val="single" w:color="CCCCCC" w:sz="4"/>
@@ -6890,7 +7778,7 @@
         </w:tc>
         <w:tc>
           <w:tcPr>
-            <w:tcW w:type="dxa" w:w="6400"/>
+            <w:tcW w:type="dxa" w:w="7200"/>
             <w:tcBorders>
               <w:top w:val="single" w:color="CCCCCC" w:sz="4"/>
               <w:left w:val="single" w:color="CCCCCC" w:sz="4"/>
@@ -6926,7 +7814,7 @@
       <w:tr>
         <w:tc>
           <w:tcPr>
-            <w:tcW w:type="dxa" w:w="3000"/>
+            <w:tcW w:type="dxa" w:w="2200"/>
             <w:tcBorders>
               <w:top w:val="single" w:color="CCCCCC" w:sz="4"/>
               <w:left w:val="single" w:color="CCCCCC" w:sz="4"/>
@@ -6957,7 +7845,7 @@
         </w:tc>
         <w:tc>
           <w:tcPr>
-            <w:tcW w:type="dxa" w:w="6400"/>
+            <w:tcW w:type="dxa" w:w="7200"/>
             <w:tcBorders>
               <w:top w:val="single" w:color="CCCCCC" w:sz="4"/>
               <w:left w:val="single" w:color="CCCCCC" w:sz="4"/>
@@ -6990,7 +7878,7 @@
       <w:tr>
         <w:tc>
           <w:tcPr>
-            <w:tcW w:type="dxa" w:w="3000"/>
+            <w:tcW w:type="dxa" w:w="2200"/>
             <w:tcBorders>
               <w:top w:val="single" w:color="CCCCCC" w:sz="4"/>
               <w:left w:val="single" w:color="CCCCCC" w:sz="4"/>
@@ -7022,7 +7910,7 @@
         </w:tc>
         <w:tc>
           <w:tcPr>
-            <w:tcW w:type="dxa" w:w="6400"/>
+            <w:tcW w:type="dxa" w:w="7200"/>
             <w:tcBorders>
               <w:top w:val="single" w:color="CCCCCC" w:sz="4"/>
               <w:left w:val="single" w:color="CCCCCC" w:sz="4"/>
@@ -7048,7 +7936,7 @@
                 <w:sz w:val="20"/>
                 <w:szCs w:val="20"/>
               </w:rPr>
-              <w:t xml:space="preserve">residency_difficulty, cost, pollution → 1 - x (выше = лучше)</w:t>
+              <w:t xml:space="preserve">residency_difficulty, cost, pollution, ru_sanctions_risk → 1 - x (выше = лучше)</w:t>
             </w:r>
           </w:p>
         </w:tc>
@@ -7056,7 +7944,7 @@
       <w:tr>
         <w:tc>
           <w:tcPr>
-            <w:tcW w:type="dxa" w:w="3000"/>
+            <w:tcW w:type="dxa" w:w="2200"/>
             <w:tcBorders>
               <w:top w:val="single" w:color="CCCCCC" w:sz="4"/>
               <w:left w:val="single" w:color="CCCCCC" w:sz="4"/>
@@ -7087,7 +7975,7 @@
         </w:tc>
         <w:tc>
           <w:tcPr>
-            <w:tcW w:type="dxa" w:w="6400"/>
+            <w:tcW w:type="dxa" w:w="7200"/>
             <w:tcBorders>
               <w:top w:val="single" w:color="CCCCCC" w:sz="4"/>
               <w:left w:val="single" w:color="CCCCCC" w:sz="4"/>
@@ -7120,7 +8008,7 @@
       <w:tr>
         <w:tc>
           <w:tcPr>
-            <w:tcW w:type="dxa" w:w="3000"/>
+            <w:tcW w:type="dxa" w:w="2200"/>
             <w:tcBorders>
               <w:top w:val="single" w:color="CCCCCC" w:sz="4"/>
               <w:left w:val="single" w:color="CCCCCC" w:sz="4"/>
@@ -7152,7 +8040,7 @@
         </w:tc>
         <w:tc>
           <w:tcPr>
-            <w:tcW w:type="dxa" w:w="6400"/>
+            <w:tcW w:type="dxa" w:w="7200"/>
             <w:tcBorders>
               <w:top w:val="single" w:color="CCCCCC" w:sz="4"/>
               <w:left w:val="single" w:color="CCCCCC" w:sz="4"/>
@@ -7186,7 +8074,7 @@
       <w:tr>
         <w:tc>
           <w:tcPr>
-            <w:tcW w:type="dxa" w:w="3000"/>
+            <w:tcW w:type="dxa" w:w="2200"/>
             <w:tcBorders>
               <w:top w:val="single" w:color="CCCCCC" w:sz="4"/>
               <w:left w:val="single" w:color="CCCCCC" w:sz="4"/>
@@ -7211,13 +8099,13 @@
                 <w:sz w:val="20"/>
                 <w:szCs w:val="20"/>
               </w:rPr>
-              <w:t xml:space="preserve">5. Бонусы</w:t>
-            </w:r>
-          </w:p>
-        </w:tc>
-        <w:tc>
-          <w:tcPr>
-            <w:tcW w:type="dxa" w:w="6400"/>
+              <w:t xml:space="preserve">5. Базовые бонусы</w:t>
+            </w:r>
+          </w:p>
+        </w:tc>
+        <w:tc>
+          <w:tcPr>
+            <w:tcW w:type="dxa" w:w="7200"/>
             <w:tcBorders>
               <w:top w:val="single" w:color="CCCCCC" w:sz="4"/>
               <w:left w:val="single" w:color="CCCCCC" w:sz="4"/>
@@ -7250,7 +8138,7 @@
       <w:tr>
         <w:tc>
           <w:tcPr>
-            <w:tcW w:type="dxa" w:w="3000"/>
+            <w:tcW w:type="dxa" w:w="2200"/>
             <w:tcBorders>
               <w:top w:val="single" w:color="CCCCCC" w:sz="4"/>
               <w:left w:val="single" w:color="CCCCCC" w:sz="4"/>
@@ -7276,13 +8164,13 @@
                 <w:sz w:val="20"/>
                 <w:szCs w:val="20"/>
               </w:rPr>
-              <w:t xml:space="preserve">6. Сортировка</w:t>
-            </w:r>
-          </w:p>
-        </w:tc>
-        <w:tc>
-          <w:tcPr>
-            <w:tcW w:type="dxa" w:w="6400"/>
+              <w:t xml:space="preserve">6. Российские бонусы</w:t>
+            </w:r>
+          </w:p>
+        </w:tc>
+        <w:tc>
+          <w:tcPr>
+            <w:tcW w:type="dxa" w:w="7200"/>
             <w:tcBorders>
               <w:top w:val="single" w:color="CCCCCC" w:sz="4"/>
               <w:left w:val="single" w:color="CCCCCC" w:sz="4"/>
@@ -7290,6 +8178,70 @@
               <w:right w:val="single" w:color="CCCCCC" w:sz="4"/>
             </w:tcBorders>
             <w:shd w:fill="D5E8F0" w:val="clear"/>
+            <w:tcMar>
+              <w:top w:type="dxa" w:w="80"/>
+              <w:left w:type="dxa" w:w="120"/>
+              <w:bottom w:type="dxa" w:w="80"/>
+              <w:right w:type="dxa" w:w="120"/>
+            </w:tcMar>
+          </w:tcPr>
+          <w:p>
+            <w:pPr>
+              <w:jc w:val="center"/>
+            </w:pPr>
+            <w:r>
+              <w:rPr>
+                <w:rFonts w:ascii="Calibri" w:cs="Calibri" w:eastAsia="Calibri" w:hAnsi="Calibri"/>
+                <w:color w:val="000000"/>
+                <w:sz w:val="20"/>
+                <w:szCs w:val="20"/>
+              </w:rPr>
+              <w:t xml:space="preserve">+0.08 за безвиз РФ, −0.04 Шенген без визы, −0.06×risk санкции, +0.04×access банкинг</w:t>
+            </w:r>
+          </w:p>
+        </w:tc>
+      </w:tr>
+      <w:tr>
+        <w:tc>
+          <w:tcPr>
+            <w:tcW w:type="dxa" w:w="2200"/>
+            <w:tcBorders>
+              <w:top w:val="single" w:color="CCCCCC" w:sz="4"/>
+              <w:left w:val="single" w:color="CCCCCC" w:sz="4"/>
+              <w:bottom w:val="single" w:color="CCCCCC" w:sz="4"/>
+              <w:right w:val="single" w:color="CCCCCC" w:sz="4"/>
+            </w:tcBorders>
+            <w:tcMar>
+              <w:top w:type="dxa" w:w="80"/>
+              <w:left w:type="dxa" w:w="120"/>
+              <w:bottom w:type="dxa" w:w="80"/>
+              <w:right w:type="dxa" w:w="120"/>
+            </w:tcMar>
+          </w:tcPr>
+          <w:p>
+            <w:pPr>
+              <w:jc w:val="left"/>
+            </w:pPr>
+            <w:r>
+              <w:rPr>
+                <w:rFonts w:ascii="Calibri" w:cs="Calibri" w:eastAsia="Calibri" w:hAnsi="Calibri"/>
+                <w:color w:val="000000"/>
+                <w:sz w:val="20"/>
+                <w:szCs w:val="20"/>
+              </w:rPr>
+              <w:t xml:space="preserve">7. Сортировка</w:t>
+            </w:r>
+          </w:p>
+        </w:tc>
+        <w:tc>
+          <w:tcPr>
+            <w:tcW w:type="dxa" w:w="7200"/>
+            <w:tcBorders>
+              <w:top w:val="single" w:color="CCCCCC" w:sz="4"/>
+              <w:left w:val="single" w:color="CCCCCC" w:sz="4"/>
+              <w:bottom w:val="single" w:color="CCCCCC" w:sz="4"/>
+              <w:right w:val="single" w:color="CCCCCC" w:sz="4"/>
+            </w:tcBorders>
             <w:tcMar>
               <w:top w:type="dxa" w:w="80"/>
               <w:left w:type="dxa" w:w="120"/>
@@ -8118,7 +9070,21 @@
           <w:sz w:val="28"/>
           <w:szCs w:val="28"/>
         </w:rPr>
-        <w:t xml:space="preserve">8.1. Левая панель</w:t>
+        <w:t xml:space="preserve">8.1. Дизайн — Cyberpunk 2077</w:t>
+      </w:r>
+    </w:p>
+    <w:p>
+      <w:pPr>
+        <w:spacing w:after="120" w:line="300"/>
+        <w:jc w:val="left"/>
+      </w:pPr>
+      <w:r>
+        <w:rPr>
+          <w:rFonts w:ascii="Calibri" w:cs="Calibri" w:eastAsia="Calibri" w:hAnsi="Calibri"/>
+          <w:sz w:val="22"/>
+          <w:szCs w:val="22"/>
+        </w:rPr>
+        <w:t xml:space="preserve">Интерфейс выполнен в стиле Cyberpunk 2077: тёмный фон (#08080f), неоновые акценты жёлтый/cyan/пурпурный, строчные линии (scanline overlay). Шрифты:</w:t>
       </w:r>
     </w:p>
     <w:p>
@@ -8136,7 +9102,7 @@
           <w:sz w:val="22"/>
           <w:szCs w:val="22"/>
         </w:rPr>
-        <w:t xml:space="preserve">💰 Слайдер бюджета $500-10 000 (шаг $100)</w:t>
+        <w:t xml:space="preserve">Exo 2 — заголовки: геометричный, sci-fi, но читабельный</w:t>
       </w:r>
     </w:p>
     <w:p>
@@ -8154,7 +9120,7 @@
           <w:sz w:val="22"/>
           <w:szCs w:val="22"/>
         </w:rPr>
-        <w:t xml:space="preserve">🛡️ Безопасность 1-5</w:t>
+        <w:t xml:space="preserve">Inter — основной текст: современный, не режет глаза</w:t>
       </w:r>
     </w:p>
     <w:p>
@@ -8172,7 +9138,55 @@
           <w:sz w:val="22"/>
           <w:szCs w:val="22"/>
         </w:rPr>
-        <w:t xml:space="preserve">☀️ Тёплый климат 1-5 (≥3 → True)</w:t>
+        <w:t xml:space="preserve">JetBrains Mono — блоки с кодом и цифрами</w:t>
+      </w:r>
+    </w:p>
+    <w:p>
+      <w:pPr>
+        <w:spacing w:after="120" w:line="300"/>
+        <w:jc w:val="left"/>
+      </w:pPr>
+      <w:r>
+        <w:rPr>
+          <w:rFonts w:ascii="Calibri" w:cs="Calibri" w:eastAsia="Calibri" w:hAnsi="Calibri"/>
+          <w:sz w:val="22"/>
+          <w:szCs w:val="22"/>
+        </w:rPr>
+        <w:t xml:space="preserve">CSS инжектируется через st.markdown(CYBERPUNK_CSS, unsafe_allow_html=True). Весь интерфейс переведён на русский язык.</w:t>
+      </w:r>
+    </w:p>
+    <w:p>
+      <w:pPr>
+        <w:pStyle w:val="Heading2"/>
+        <w:spacing w:after="120" w:before="240"/>
+      </w:pPr>
+      <w:r>
+        <w:rPr>
+          <w:rFonts w:ascii="Calibri" w:cs="Calibri" w:eastAsia="Calibri" w:hAnsi="Calibri"/>
+          <w:b/>
+          <w:bCs/>
+          <w:color w:val="1F4E79"/>
+          <w:sz w:val="28"/>
+          <w:szCs w:val="28"/>
+        </w:rPr>
+        <w:t xml:space="preserve">8.2. Левая панель</w:t>
+      </w:r>
+    </w:p>
+    <w:p>
+      <w:pPr>
+        <w:pStyle w:val="Heading3"/>
+        <w:spacing w:after="80" w:before="180"/>
+      </w:pPr>
+      <w:r>
+        <w:rPr>
+          <w:rFonts w:ascii="Calibri" w:cs="Calibri" w:eastAsia="Calibri" w:hAnsi="Calibri"/>
+          <w:b/>
+          <w:bCs/>
+          <w:color w:val="2F5496"/>
+          <w:sz w:val="24"/>
+          <w:szCs w:val="24"/>
+        </w:rPr>
+        <w:t xml:space="preserve">Блок «Профиль россиянина»</w:t>
       </w:r>
     </w:p>
     <w:p>
@@ -8190,7 +9204,7 @@
           <w:sz w:val="22"/>
           <w:szCs w:val="22"/>
         </w:rPr>
-        <w:t xml:space="preserve">🛂 Лёгкость визы 1-5</w:t>
+        <w:t xml:space="preserve">Чекбокс «Я ИЗ РОССИИ» (по умолчанию включён) — активирует российские бонусы/штрафы</w:t>
       </w:r>
     </w:p>
     <w:p>
@@ -8208,7 +9222,7 @@
           <w:sz w:val="22"/>
           <w:szCs w:val="22"/>
         </w:rPr>
-        <w:t xml:space="preserve">🏥 Медицина 1-5</w:t>
+        <w:t xml:space="preserve">Чекбокс «Нужен банковский счёт» — увеличивает вес ru_banking_access</w:t>
       </w:r>
     </w:p>
     <w:p>
@@ -8226,7 +9240,24 @@
           <w:sz w:val="22"/>
           <w:szCs w:val="22"/>
         </w:rPr>
-        <w:t xml:space="preserve">Мультиселект знакомых языков (18 опций)</w:t>
+        <w:t xml:space="preserve">Чекбокс «Есть шенгенская / ЕС виза» — снимает штраф за Шенген-страны</w:t>
+      </w:r>
+    </w:p>
+    <w:p>
+      <w:pPr>
+        <w:pStyle w:val="Heading3"/>
+        <w:spacing w:after="80" w:before="180"/>
+      </w:pPr>
+      <w:r>
+        <w:rPr>
+          <w:rFonts w:ascii="Calibri" w:cs="Calibri" w:eastAsia="Calibri" w:hAnsi="Calibri"/>
+          <w:b/>
+          <w:bCs/>
+          <w:color w:val="2F5496"/>
+          <w:sz w:val="24"/>
+          <w:szCs w:val="24"/>
+        </w:rPr>
+        <w:t xml:space="preserve">Основные параметры</w:t>
       </w:r>
     </w:p>
     <w:p>
@@ -8244,179 +9275,7 @@
           <w:sz w:val="22"/>
           <w:szCs w:val="22"/>
         </w:rPr>
-        <w:t xml:space="preserve">Слайдер Top-N (5-30)</w:t>
-      </w:r>
-    </w:p>
-    <w:p>
-      <w:pPr>
-        <w:pStyle w:val="Heading2"/>
-        <w:spacing w:after="120" w:before="240"/>
-      </w:pPr>
-      <w:r>
-        <w:rPr>
-          <w:rFonts w:ascii="Calibri" w:cs="Calibri" w:eastAsia="Calibri" w:hAnsi="Calibri"/>
-          <w:b/>
-          <w:bCs/>
-          <w:color w:val="1F4E79"/>
-          <w:sz w:val="28"/>
-          <w:szCs w:val="28"/>
-        </w:rPr>
-        <w:t xml:space="preserve">8.2. Основная область</w:t>
-      </w:r>
-    </w:p>
-    <w:p>
-      <w:pPr>
-        <w:pStyle w:val="Heading3"/>
-        <w:spacing w:after="80" w:before="180"/>
-      </w:pPr>
-      <w:r>
-        <w:rPr>
-          <w:rFonts w:ascii="Calibri" w:cs="Calibri" w:eastAsia="Calibri" w:hAnsi="Calibri"/>
-          <w:b/>
-          <w:bCs/>
-          <w:color w:val="2F5496"/>
-          <w:sz w:val="24"/>
-          <w:szCs w:val="24"/>
-        </w:rPr>
-        <w:t xml:space="preserve">🗺️ Choropleth-карта мира</w:t>
-      </w:r>
-    </w:p>
-    <w:p>
-      <w:pPr>
-        <w:spacing w:after="120" w:line="300"/>
-        <w:jc w:val="left"/>
-      </w:pPr>
-      <w:r>
-        <w:rPr>
-          <w:rFonts w:ascii="Calibri" w:cs="Calibri" w:eastAsia="Calibri" w:hAnsi="Calibri"/>
-          <w:sz w:val="22"/>
-          <w:szCs w:val="22"/>
-        </w:rPr>
-        <w:t xml:space="preserve">Plotly choropleth с цветовой шкалой от красного (низкий score) до зелёного (высокий). Диапазон color-axis обрезан по 5-95 перцентилям — иначе цвета "сжимаются" из-за выбросов. Hover показывает: страна, score, ключевые метрики. Клик по точке → выбор страны для детального анализа.</w:t>
-      </w:r>
-    </w:p>
-    <w:p>
-      <w:pPr>
-        <w:pStyle w:val="Heading3"/>
-        <w:spacing w:after="80" w:before="180"/>
-      </w:pPr>
-      <w:r>
-        <w:rPr>
-          <w:rFonts w:ascii="Calibri" w:cs="Calibri" w:eastAsia="Calibri" w:hAnsi="Calibri"/>
-          <w:b/>
-          <w:bCs/>
-          <w:color w:val="2F5496"/>
-          <w:sz w:val="24"/>
-          <w:szCs w:val="24"/>
-        </w:rPr>
-        <w:t xml:space="preserve">🏆 Таблица топ-N</w:t>
-      </w:r>
-    </w:p>
-    <w:p>
-      <w:pPr>
-        <w:spacing w:after="120" w:line="300"/>
-        <w:jc w:val="left"/>
-      </w:pPr>
-      <w:r>
-        <w:rPr>
-          <w:rFonts w:ascii="Calibri" w:cs="Calibri" w:eastAsia="Calibri" w:hAnsi="Calibri"/>
-          <w:sz w:val="22"/>
-          <w:szCs w:val="22"/>
-        </w:rPr>
-        <w:t xml:space="preserve">Колонки: флаг-эмодзи, ISO3, страна, score, стоимость, безопасность, сложность визы, ЕС, DNV, климат. Флаги генерируются из ISO2 через региональные индикаторы Unicode. Строки кликабельны (selection_mode="single-row").</w:t>
-      </w:r>
-    </w:p>
-    <w:p>
-      <w:pPr>
-        <w:pStyle w:val="Heading3"/>
-        <w:spacing w:after="80" w:before="180"/>
-      </w:pPr>
-      <w:r>
-        <w:rPr>
-          <w:rFonts w:ascii="Calibri" w:cs="Calibri" w:eastAsia="Calibri" w:hAnsi="Calibri"/>
-          <w:b/>
-          <w:bCs/>
-          <w:color w:val="2F5496"/>
-          <w:sz w:val="24"/>
-          <w:szCs w:val="24"/>
-        </w:rPr>
-        <w:t xml:space="preserve">📊 Radar chart</w:t>
-      </w:r>
-    </w:p>
-    <w:p>
-      <w:pPr>
-        <w:spacing w:after="120" w:line="300"/>
-        <w:jc w:val="left"/>
-      </w:pPr>
-      <w:r>
-        <w:rPr>
-          <w:rFonts w:ascii="Calibri" w:cs="Calibri" w:eastAsia="Calibri" w:hAnsi="Calibri"/>
-          <w:sz w:val="22"/>
-          <w:szCs w:val="22"/>
-        </w:rPr>
-        <w:t xml:space="preserve">Plotly Scatterpolar по 8 осям: Безопасность, Здравоохранение, Доступность, Долголетие, Покупательная способность, Простота визы, ВВП, Экология. Колонки "чем ниже = лучше" (cost, residency_difficulty, pollution) инвертируются перед построением.</w:t>
-      </w:r>
-    </w:p>
-    <w:p>
-      <w:pPr>
-        <w:pStyle w:val="Heading3"/>
-        <w:spacing w:after="80" w:before="180"/>
-      </w:pPr>
-      <w:r>
-        <w:rPr>
-          <w:rFonts w:ascii="Calibri" w:cs="Calibri" w:eastAsia="Calibri" w:hAnsi="Calibri"/>
-          <w:b/>
-          <w:bCs/>
-          <w:color w:val="2F5496"/>
-          <w:sz w:val="24"/>
-          <w:szCs w:val="24"/>
-        </w:rPr>
-        <w:t xml:space="preserve">💡 Блок "Почему эта страна?"</w:t>
-      </w:r>
-    </w:p>
-    <w:p>
-      <w:pPr>
-        <w:spacing w:after="120" w:line="300"/>
-        <w:jc w:val="left"/>
-      </w:pPr>
-      <w:r>
-        <w:rPr>
-          <w:rFonts w:ascii="Calibri" w:cs="Calibri" w:eastAsia="Calibri" w:hAnsi="Calibri"/>
-          <w:sz w:val="22"/>
-          <w:szCs w:val="22"/>
-        </w:rPr>
-        <w:t xml:space="preserve">Вызывает recommender.explain() и отображает результат через st.code() — моноширинный шрифт сохраняет выравнивание ASCII-баров.</w:t>
-      </w:r>
-    </w:p>
-    <w:p>
-      <w:pPr>
-        <w:pStyle w:val="Heading2"/>
-        <w:spacing w:after="120" w:before="240"/>
-      </w:pPr>
-      <w:r>
-        <w:rPr>
-          <w:rFonts w:ascii="Calibri" w:cs="Calibri" w:eastAsia="Calibri" w:hAnsi="Calibri"/>
-          <w:b/>
-          <w:bCs/>
-          <w:color w:val="1F4E79"/>
-          <w:sz w:val="28"/>
-          <w:szCs w:val="28"/>
-        </w:rPr>
-        <w:t xml:space="preserve">8.3. Состояние и интерактивность</w:t>
-      </w:r>
-    </w:p>
-    <w:p>
-      <w:pPr>
-        <w:spacing w:after="120" w:line="300"/>
-        <w:jc w:val="left"/>
-      </w:pPr>
-      <w:r>
-        <w:rPr>
-          <w:rFonts w:ascii="Calibri" w:cs="Calibri" w:eastAsia="Calibri" w:hAnsi="Calibri"/>
-          <w:sz w:val="22"/>
-          <w:szCs w:val="22"/>
-        </w:rPr>
-        <w:t xml:space="preserve">Выбор страны хранится в st.session_state["selected_iso3"]. Два источника обновляют его независимо:</w:t>
+        <w:t xml:space="preserve">Слайдер бюджета $500–10 000 (шаг $100)</w:t>
       </w:r>
     </w:p>
     <w:p>
@@ -8434,7 +9293,7 @@
           <w:sz w:val="22"/>
           <w:szCs w:val="22"/>
         </w:rPr>
-        <w:t xml:space="preserve">Клик по карте: map_event.selection.points[0]["location"]</w:t>
+        <w:t xml:space="preserve">Безопасность 1–5, Тёплый климат 1–5 (≥3 → True), Лёгкость визы 1–5, Медицина 1–5</w:t>
       </w:r>
     </w:p>
     <w:p>
@@ -8452,21 +9311,25 @@
           <w:sz w:val="22"/>
           <w:szCs w:val="22"/>
         </w:rPr>
-        <w:t xml:space="preserve">Клик по строке таблицы: table_event.selection.rows[0]</w:t>
-      </w:r>
-    </w:p>
-    <w:p>
-      <w:pPr>
-        <w:spacing w:after="120" w:line="300"/>
-        <w:jc w:val="left"/>
-      </w:pPr>
-      <w:r>
-        <w:rPr>
-          <w:rFonts w:ascii="Calibri" w:cs="Calibri" w:eastAsia="Calibri" w:hAnsi="Calibri"/>
-          <w:sz w:val="22"/>
-          <w:szCs w:val="22"/>
-        </w:rPr>
-        <w:t xml:space="preserve">Оба используют on_select="rerun" (доступно с Streamlit 1.33+). Кэширование через @st.cache_data: пересчёт рекомендаций только при изменении параметров профиля.</w:t>
+        <w:t xml:space="preserve">Мультиселект знакомых языков (18 опций на русском; по умолчанию Русский + Английский при RU-режиме)</w:t>
+      </w:r>
+    </w:p>
+    <w:p>
+      <w:pPr>
+        <w:pStyle w:val="ListParagraph"/>
+        <w:numPr>
+          <w:ilvl w:val="0"/>
+          <w:numId w:val="2"/>
+        </w:numPr>
+        <w:spacing w:after="60"/>
+      </w:pPr>
+      <w:r>
+        <w:rPr>
+          <w:rFonts w:ascii="Calibri" w:cs="Calibri" w:eastAsia="Calibri" w:hAnsi="Calibri"/>
+          <w:sz w:val="22"/>
+          <w:szCs w:val="22"/>
+        </w:rPr>
+        <w:t xml:space="preserve">Слайдер Top-N (5–30)</w:t>
       </w:r>
     </w:p>
     <w:p>
@@ -8483,7 +9346,259 @@
           <w:sz w:val="28"/>
           <w:szCs w:val="28"/>
         </w:rPr>
-        <w:t xml:space="preserve">8.4. Запуск</w:t>
+        <w:t xml:space="preserve">8.3. Основная область</w:t>
+      </w:r>
+    </w:p>
+    <w:p>
+      <w:pPr>
+        <w:pStyle w:val="Heading3"/>
+        <w:spacing w:after="80" w:before="180"/>
+      </w:pPr>
+      <w:r>
+        <w:rPr>
+          <w:rFonts w:ascii="Calibri" w:cs="Calibri" w:eastAsia="Calibri" w:hAnsi="Calibri"/>
+          <w:b/>
+          <w:bCs/>
+          <w:color w:val="2F5496"/>
+          <w:sz w:val="24"/>
+          <w:szCs w:val="24"/>
+        </w:rPr>
+        <w:t xml:space="preserve">Choropleth-карта мира</w:t>
+      </w:r>
+    </w:p>
+    <w:p>
+      <w:pPr>
+        <w:spacing w:after="120" w:line="300"/>
+        <w:jc w:val="left"/>
+      </w:pPr>
+      <w:r>
+        <w:rPr>
+          <w:rFonts w:ascii="Calibri" w:cs="Calibri" w:eastAsia="Calibri" w:hAnsi="Calibri"/>
+          <w:sz w:val="22"/>
+          <w:szCs w:val="22"/>
+        </w:rPr>
+        <w:t xml:space="preserve">Plotly choropleth с цветовой шкалой (красный → жёлтый). Диапазон color-axis обрезан по 5–95 перцентилям. Тёмная тема карты в стиле Cyberpunk: суша #1a1a28, океан #08080f, контуры cyan. Hover: страна, score, ключевые метрики. Клик → выбор страны.</w:t>
+      </w:r>
+    </w:p>
+    <w:p>
+      <w:pPr>
+        <w:pStyle w:val="Heading3"/>
+        <w:spacing w:after="80" w:before="180"/>
+      </w:pPr>
+      <w:r>
+        <w:rPr>
+          <w:rFonts w:ascii="Calibri" w:cs="Calibri" w:eastAsia="Calibri" w:hAnsi="Calibri"/>
+          <w:b/>
+          <w:bCs/>
+          <w:color w:val="2F5496"/>
+          <w:sz w:val="24"/>
+          <w:szCs w:val="24"/>
+        </w:rPr>
+        <w:t xml:space="preserve">Таблица топ-N</w:t>
+      </w:r>
+    </w:p>
+    <w:p>
+      <w:pPr>
+        <w:spacing w:after="120" w:line="300"/>
+        <w:jc w:val="left"/>
+      </w:pPr>
+      <w:r>
+        <w:rPr>
+          <w:rFonts w:ascii="Calibri" w:cs="Calibri" w:eastAsia="Calibri" w:hAnsi="Calibri"/>
+          <w:sz w:val="22"/>
+          <w:szCs w:val="22"/>
+        </w:rPr>
+        <w:t xml:space="preserve">Колонки: ISO3, Страна (англ.), На русском, Оценка, Стоимость жизни, Безопасность, Сложность визы, ЕС, Климат. При включённом режиме россиянина добавляются колонки Безвиз РФ и Банкинг (++++ шкала). Строки кликабельны.</w:t>
+      </w:r>
+    </w:p>
+    <w:p>
+      <w:pPr>
+        <w:pStyle w:val="Heading3"/>
+        <w:spacing w:after="80" w:before="180"/>
+      </w:pPr>
+      <w:r>
+        <w:rPr>
+          <w:rFonts w:ascii="Calibri" w:cs="Calibri" w:eastAsia="Calibri" w:hAnsi="Calibri"/>
+          <w:b/>
+          <w:bCs/>
+          <w:color w:val="2F5496"/>
+          <w:sz w:val="24"/>
+          <w:szCs w:val="24"/>
+        </w:rPr>
+        <w:t xml:space="preserve">Radar chart</w:t>
+      </w:r>
+    </w:p>
+    <w:p>
+      <w:pPr>
+        <w:spacing w:after="120" w:line="300"/>
+        <w:jc w:val="left"/>
+      </w:pPr>
+      <w:r>
+        <w:rPr>
+          <w:rFonts w:ascii="Calibri" w:cs="Calibri" w:eastAsia="Calibri" w:hAnsi="Calibri"/>
+          <w:sz w:val="22"/>
+          <w:szCs w:val="22"/>
+        </w:rPr>
+        <w:t xml:space="preserve">Plotly Scatterpolar по 8 осям: Безопасность, Здравоохранение, Доступность, Долголетие, Покупательная сила, Простота визы, ВВП, Экология. Цветовая схема Cyberpunk: жёлтая заливка, cyan-сетка.</w:t>
+      </w:r>
+    </w:p>
+    <w:p>
+      <w:pPr>
+        <w:pStyle w:val="Heading3"/>
+        <w:spacing w:after="80" w:before="180"/>
+      </w:pPr>
+      <w:r>
+        <w:rPr>
+          <w:rFonts w:ascii="Calibri" w:cs="Calibri" w:eastAsia="Calibri" w:hAnsi="Calibri"/>
+          <w:b/>
+          <w:bCs/>
+          <w:color w:val="2F5496"/>
+          <w:sz w:val="24"/>
+          <w:szCs w:val="24"/>
+        </w:rPr>
+        <w:t xml:space="preserve">Детальный анализ</w:t>
+      </w:r>
+    </w:p>
+    <w:p>
+      <w:pPr>
+        <w:spacing w:after="120" w:line="300"/>
+        <w:jc w:val="left"/>
+      </w:pPr>
+      <w:r>
+        <w:rPr>
+          <w:rFonts w:ascii="Calibri" w:cs="Calibri" w:eastAsia="Calibri" w:hAnsi="Calibri"/>
+          <w:sz w:val="22"/>
+          <w:szCs w:val="22"/>
+        </w:rPr>
+        <w:t xml:space="preserve">Метрики оценки: Итог. оценка, Косинус, Бонус кластера, Климат/Язык. При RU-режиме — три дополнительные карточки: Безвиз РФ, Санкции, Банкинг РФ. Блок «Почему эта страна?» — развёрнутое объяснение через recommender.explain().</w:t>
+      </w:r>
+    </w:p>
+    <w:p>
+      <w:pPr>
+        <w:pStyle w:val="Heading2"/>
+        <w:spacing w:after="120" w:before="240"/>
+      </w:pPr>
+      <w:r>
+        <w:rPr>
+          <w:rFonts w:ascii="Calibri" w:cs="Calibri" w:eastAsia="Calibri" w:hAnsi="Calibri"/>
+          <w:b/>
+          <w:bCs/>
+          <w:color w:val="1F4E79"/>
+          <w:sz w:val="28"/>
+          <w:szCs w:val="28"/>
+        </w:rPr>
+        <w:t xml:space="preserve">8.4. Информационные блоки</w:t>
+      </w:r>
+    </w:p>
+    <w:p>
+      <w:pPr>
+        <w:pStyle w:val="ListParagraph"/>
+        <w:numPr>
+          <w:ilvl w:val="0"/>
+          <w:numId w:val="2"/>
+        </w:numPr>
+        <w:spacing w:after="60"/>
+      </w:pPr>
+      <w:r>
+        <w:rPr>
+          <w:rFonts w:ascii="Calibri" w:cs="Calibri" w:eastAsia="Calibri" w:hAnsi="Calibri"/>
+          <w:sz w:val="22"/>
+          <w:szCs w:val="22"/>
+        </w:rPr>
+        <w:t xml:space="preserve">«Объяснение параметра Сложность визы» — шкала 1–5 с примерами стран</w:t>
+      </w:r>
+    </w:p>
+    <w:p>
+      <w:pPr>
+        <w:pStyle w:val="ListParagraph"/>
+        <w:numPr>
+          <w:ilvl w:val="0"/>
+          <w:numId w:val="2"/>
+        </w:numPr>
+        <w:spacing w:after="60"/>
+      </w:pPr>
+      <w:r>
+        <w:rPr>
+          <w:rFonts w:ascii="Calibri" w:cs="Calibri" w:eastAsia="Calibri" w:hAnsi="Calibri"/>
+          <w:sz w:val="22"/>
+          <w:szCs w:val="22"/>
+        </w:rPr>
+        <w:t xml:space="preserve">«Как работает режим Я из России» — описание трёх факторов: безвизовость, санкционный риск, банкинг</w:t>
+      </w:r>
+    </w:p>
+    <w:p>
+      <w:pPr>
+        <w:pStyle w:val="Heading2"/>
+        <w:spacing w:after="120" w:before="240"/>
+      </w:pPr>
+      <w:r>
+        <w:rPr>
+          <w:rFonts w:ascii="Calibri" w:cs="Calibri" w:eastAsia="Calibri" w:hAnsi="Calibri"/>
+          <w:b/>
+          <w:bCs/>
+          <w:color w:val="1F4E79"/>
+          <w:sz w:val="28"/>
+          <w:szCs w:val="28"/>
+        </w:rPr>
+        <w:t xml:space="preserve">8.5. Развёртывание</w:t>
+      </w:r>
+    </w:p>
+    <w:p>
+      <w:pPr>
+        <w:spacing w:after="120" w:line="300"/>
+        <w:jc w:val="left"/>
+      </w:pPr>
+      <w:r>
+        <w:rPr>
+          <w:rFonts w:ascii="Calibri" w:cs="Calibri" w:eastAsia="Calibri" w:hAnsi="Calibri"/>
+          <w:sz w:val="22"/>
+          <w:szCs w:val="22"/>
+        </w:rPr>
+        <w:t xml:space="preserve">Приложение опубликовано на Streamlit Community Cloud:</w:t>
+      </w:r>
+    </w:p>
+    <w:p>
+      <w:pPr>
+        <w:shd w:fill="F2F2F2" w:val="clear"/>
+        <w:spacing w:after="0" w:line="260"/>
+      </w:pPr>
+      <w:r>
+        <w:rPr>
+          <w:rFonts w:ascii="Consolas" w:cs="Consolas" w:eastAsia="Consolas" w:hAnsi="Consolas"/>
+          <w:color w:val="1F2937"/>
+          <w:sz w:val="18"/>
+          <w:szCs w:val="18"/>
+        </w:rPr>
+        <w:t xml:space="preserve">https://github.com/PacTu6ka/relocation_recommender</w:t>
+      </w:r>
+    </w:p>
+    <w:p>
+      <w:pPr>
+        <w:shd w:fill="F2F2F2" w:val="clear"/>
+        <w:spacing w:after="0" w:line="260"/>
+      </w:pPr>
+      <w:r>
+        <w:rPr>
+          <w:rFonts w:ascii="Consolas" w:cs="Consolas" w:eastAsia="Consolas" w:hAnsi="Consolas"/>
+          <w:color w:val="1F2937"/>
+          <w:sz w:val="18"/>
+          <w:szCs w:val="18"/>
+        </w:rPr>
+        <w:t xml:space="preserve">app/streamlit_app.py → main branch</w:t>
+      </w:r>
+    </w:p>
+    <w:p>
+      <w:pPr>
+        <w:spacing w:after="120" w:line="300"/>
+        <w:jc w:val="left"/>
+      </w:pPr>
+      <w:r>
+        <w:rPr>
+          <w:rFonts w:ascii="Calibri" w:cs="Calibri" w:eastAsia="Calibri" w:hAnsi="Calibri"/>
+          <w:sz w:val="22"/>
+          <w:szCs w:val="22"/>
+        </w:rPr>
+        <w:t xml:space="preserve">Локальный запуск:</w:t>
       </w:r>
     </w:p>
     <w:p>
@@ -9002,7 +10117,7 @@
                 <w:sz w:val="20"/>
                 <w:szCs w:val="20"/>
               </w:rPr>
-              <w:t xml:space="preserve">Hit Rate (идеал в топ-10)</w:t>
+              <w:t xml:space="preserve">Hit Rate (все 59 профилей)</w:t>
             </w:r>
           </w:p>
         </w:tc>
@@ -9033,7 +10148,7 @@
                 <w:sz w:val="20"/>
                 <w:szCs w:val="20"/>
               </w:rPr>
-              <w:t xml:space="preserve">96.0 % (48/50)</w:t>
+              <w:t xml:space="preserve">96.6 % (57/59)</w:t>
             </w:r>
           </w:p>
         </w:tc>
@@ -9067,7 +10182,7 @@
                 <w:sz w:val="20"/>
                 <w:szCs w:val="20"/>
               </w:rPr>
-              <w:t xml:space="preserve">NDCG@10 (все)</w:t>
+              <w:t xml:space="preserve">Hit Rate (российские)</w:t>
             </w:r>
           </w:p>
         </w:tc>
@@ -9099,7 +10214,7 @@
                 <w:sz w:val="20"/>
                 <w:szCs w:val="20"/>
               </w:rPr>
-              <w:t xml:space="preserve">0.7906</w:t>
+              <w:t xml:space="preserve">100.0 % (9/9)</w:t>
             </w:r>
           </w:p>
         </w:tc>
@@ -9132,7 +10247,7 @@
                 <w:sz w:val="20"/>
                 <w:szCs w:val="20"/>
               </w:rPr>
-              <w:t xml:space="preserve">NDCG@10 (чистые)</w:t>
+              <w:t xml:space="preserve">NDCG@10 (все)</w:t>
             </w:r>
           </w:p>
         </w:tc>
@@ -9163,7 +10278,7 @@
                 <w:sz w:val="20"/>
                 <w:szCs w:val="20"/>
               </w:rPr>
-              <w:t xml:space="preserve">0.7775</w:t>
+              <w:t xml:space="preserve">0.7608</w:t>
             </w:r>
           </w:p>
         </w:tc>
@@ -9197,7 +10312,7 @@
                 <w:sz w:val="20"/>
                 <w:szCs w:val="20"/>
               </w:rPr>
-              <w:t xml:space="preserve">NDCG@10 (шумные)</w:t>
+              <w:t xml:space="preserve">NDCG@10 (чистые)</w:t>
             </w:r>
           </w:p>
         </w:tc>
@@ -9229,7 +10344,7 @@
                 <w:sz w:val="20"/>
                 <w:szCs w:val="20"/>
               </w:rPr>
-              <w:t xml:space="preserve">0.8037</w:t>
+              <w:t xml:space="preserve">0.7820</w:t>
             </w:r>
           </w:p>
         </w:tc>
@@ -9262,7 +10377,7 @@
                 <w:sz w:val="20"/>
                 <w:szCs w:val="20"/>
               </w:rPr>
-              <w:t xml:space="preserve">Coverage</w:t>
+              <w:t xml:space="preserve">NDCG@10 (шумные)</w:t>
             </w:r>
           </w:p>
         </w:tc>
@@ -9293,7 +10408,7 @@
                 <w:sz w:val="20"/>
                 <w:szCs w:val="20"/>
               </w:rPr>
-              <w:t xml:space="preserve">87.4 % (76/87)</w:t>
+              <w:t xml:space="preserve">0.7483</w:t>
             </w:r>
           </w:p>
         </w:tc>
@@ -9327,6 +10442,136 @@
                 <w:sz w:val="20"/>
                 <w:szCs w:val="20"/>
               </w:rPr>
+              <w:t xml:space="preserve">NDCG@10 (российские)</w:t>
+            </w:r>
+          </w:p>
+        </w:tc>
+        <w:tc>
+          <w:tcPr>
+            <w:tcW w:type="dxa" w:w="3600"/>
+            <w:tcBorders>
+              <w:top w:val="single" w:color="CCCCCC" w:sz="4"/>
+              <w:left w:val="single" w:color="CCCCCC" w:sz="4"/>
+              <w:bottom w:val="single" w:color="CCCCCC" w:sz="4"/>
+              <w:right w:val="single" w:color="CCCCCC" w:sz="4"/>
+            </w:tcBorders>
+            <w:shd w:fill="D5E8F0" w:val="clear"/>
+            <w:tcMar>
+              <w:top w:type="dxa" w:w="80"/>
+              <w:left w:type="dxa" w:w="120"/>
+              <w:bottom w:type="dxa" w:w="80"/>
+              <w:right w:type="dxa" w:w="120"/>
+            </w:tcMar>
+          </w:tcPr>
+          <w:p>
+            <w:pPr>
+              <w:jc w:val="center"/>
+            </w:pPr>
+            <w:r>
+              <w:rPr>
+                <w:rFonts w:ascii="Calibri" w:cs="Calibri" w:eastAsia="Calibri" w:hAnsi="Calibri"/>
+                <w:color w:val="000000"/>
+                <w:sz w:val="20"/>
+                <w:szCs w:val="20"/>
+              </w:rPr>
+              <w:t xml:space="preserve">0.7368</w:t>
+            </w:r>
+          </w:p>
+        </w:tc>
+      </w:tr>
+      <w:tr>
+        <w:tc>
+          <w:tcPr>
+            <w:tcW w:type="dxa" w:w="5800"/>
+            <w:tcBorders>
+              <w:top w:val="single" w:color="CCCCCC" w:sz="4"/>
+              <w:left w:val="single" w:color="CCCCCC" w:sz="4"/>
+              <w:bottom w:val="single" w:color="CCCCCC" w:sz="4"/>
+              <w:right w:val="single" w:color="CCCCCC" w:sz="4"/>
+            </w:tcBorders>
+            <w:tcMar>
+              <w:top w:type="dxa" w:w="80"/>
+              <w:left w:type="dxa" w:w="120"/>
+              <w:bottom w:type="dxa" w:w="80"/>
+              <w:right w:type="dxa" w:w="120"/>
+            </w:tcMar>
+          </w:tcPr>
+          <w:p>
+            <w:pPr>
+              <w:jc w:val="left"/>
+            </w:pPr>
+            <w:r>
+              <w:rPr>
+                <w:rFonts w:ascii="Calibri" w:cs="Calibri" w:eastAsia="Calibri" w:hAnsi="Calibri"/>
+                <w:color w:val="000000"/>
+                <w:sz w:val="20"/>
+                <w:szCs w:val="20"/>
+              </w:rPr>
+              <w:t xml:space="preserve">Coverage</w:t>
+            </w:r>
+          </w:p>
+        </w:tc>
+        <w:tc>
+          <w:tcPr>
+            <w:tcW w:type="dxa" w:w="3600"/>
+            <w:tcBorders>
+              <w:top w:val="single" w:color="CCCCCC" w:sz="4"/>
+              <w:left w:val="single" w:color="CCCCCC" w:sz="4"/>
+              <w:bottom w:val="single" w:color="CCCCCC" w:sz="4"/>
+              <w:right w:val="single" w:color="CCCCCC" w:sz="4"/>
+            </w:tcBorders>
+            <w:tcMar>
+              <w:top w:type="dxa" w:w="80"/>
+              <w:left w:type="dxa" w:w="120"/>
+              <w:bottom w:type="dxa" w:w="80"/>
+              <w:right w:type="dxa" w:w="120"/>
+            </w:tcMar>
+          </w:tcPr>
+          <w:p>
+            <w:pPr>
+              <w:jc w:val="center"/>
+            </w:pPr>
+            <w:r>
+              <w:rPr>
+                <w:rFonts w:ascii="Calibri" w:cs="Calibri" w:eastAsia="Calibri" w:hAnsi="Calibri"/>
+                <w:color w:val="000000"/>
+                <w:sz w:val="20"/>
+                <w:szCs w:val="20"/>
+              </w:rPr>
+              <w:t xml:space="preserve">85.2 % (75/88)</w:t>
+            </w:r>
+          </w:p>
+        </w:tc>
+      </w:tr>
+      <w:tr>
+        <w:tc>
+          <w:tcPr>
+            <w:tcW w:type="dxa" w:w="5800"/>
+            <w:tcBorders>
+              <w:top w:val="single" w:color="CCCCCC" w:sz="4"/>
+              <w:left w:val="single" w:color="CCCCCC" w:sz="4"/>
+              <w:bottom w:val="single" w:color="CCCCCC" w:sz="4"/>
+              <w:right w:val="single" w:color="CCCCCC" w:sz="4"/>
+            </w:tcBorders>
+            <w:shd w:fill="D5E8F0" w:val="clear"/>
+            <w:tcMar>
+              <w:top w:type="dxa" w:w="80"/>
+              <w:left w:type="dxa" w:w="120"/>
+              <w:bottom w:type="dxa" w:w="80"/>
+              <w:right w:type="dxa" w:w="120"/>
+            </w:tcMar>
+          </w:tcPr>
+          <w:p>
+            <w:pPr>
+              <w:jc w:val="left"/>
+            </w:pPr>
+            <w:r>
+              <w:rPr>
+                <w:rFonts w:ascii="Calibri" w:cs="Calibri" w:eastAsia="Calibri" w:hAnsi="Calibri"/>
+                <w:color w:val="000000"/>
+                <w:sz w:val="20"/>
+                <w:szCs w:val="20"/>
+              </w:rPr>
               <w:t xml:space="preserve">Diversity@10</w:t>
             </w:r>
           </w:p>
@@ -9359,7 +10604,7 @@
                 <w:sz w:val="20"/>
                 <w:szCs w:val="20"/>
               </w:rPr>
-              <w:t xml:space="preserve">0.0456</w:t>
+              <w:t xml:space="preserve">0.0508</w:t>
             </w:r>
           </w:p>
         </w:tc>
@@ -9393,7 +10638,7 @@
           <w:sz w:val="22"/>
           <w:szCs w:val="22"/>
         </w:rPr>
-        <w:t xml:space="preserve">Из 48 попаданий: 29 на 1 месте (60 %), 13 на 2 месте, остальные 6 — позиции 3-10.</w:t>
+        <w:t xml:space="preserve">Из 57 попаданий: 30 на 1 месте (53 %), 14 на 2 месте, 8 на 3 месте, 4 на 4 месте, 1 на 7 месте.</w:t>
       </w:r>
     </w:p>
     <w:p>
@@ -9410,7 +10655,21 @@
           <w:sz w:val="24"/>
           <w:szCs w:val="24"/>
         </w:rPr>
-        <w:t xml:space="preserve">Два промаха</w:t>
+        <w:t xml:space="preserve">Российские профили — топ результаты</w:t>
+      </w:r>
+    </w:p>
+    <w:p>
+      <w:pPr>
+        <w:spacing w:after="120" w:line="300"/>
+        <w:jc w:val="left"/>
+      </w:pPr>
+      <w:r>
+        <w:rPr>
+          <w:rFonts w:ascii="Calibri" w:cs="Calibri" w:eastAsia="Calibri" w:hAnsi="Calibri"/>
+          <w:sz w:val="22"/>
+          <w:szCs w:val="22"/>
+        </w:rPr>
+        <w:t xml:space="preserve">9 профилей с user_is_russian=True (целевые: GEO, ARM, SRB, ARE, THA, MNE, IDN, ARG, MEX):</w:t>
       </w:r>
     </w:p>
     <w:p>
@@ -9428,7 +10687,7 @@
           <w:sz w:val="22"/>
           <w:szCs w:val="22"/>
         </w:rPr>
-        <w:t xml:space="preserve">POL (Польша) — вытесняется соседями (Чехия, Венгрия) с более выгодным профилем</w:t>
+        <w:t xml:space="preserve">GEO, SRB, ARE, THA — rank 1 (идеальное совпадение)</w:t>
       </w:r>
     </w:p>
     <w:p>
@@ -9446,6 +10705,91 @@
           <w:sz w:val="22"/>
           <w:szCs w:val="22"/>
         </w:rPr>
+        <w:t xml:space="preserve">ARM — rank 2</w:t>
+      </w:r>
+    </w:p>
+    <w:p>
+      <w:pPr>
+        <w:pStyle w:val="ListParagraph"/>
+        <w:numPr>
+          <w:ilvl w:val="0"/>
+          <w:numId w:val="2"/>
+        </w:numPr>
+        <w:spacing w:after="60"/>
+      </w:pPr>
+      <w:r>
+        <w:rPr>
+          <w:rFonts w:ascii="Calibri" w:cs="Calibri" w:eastAsia="Calibri" w:hAnsi="Calibri"/>
+          <w:sz w:val="22"/>
+          <w:szCs w:val="22"/>
+        </w:rPr>
+        <w:t xml:space="preserve">MNE, IDN, ARG, MEX — rank 3</w:t>
+      </w:r>
+    </w:p>
+    <w:p>
+      <w:pPr>
+        <w:spacing w:after="120" w:line="300"/>
+        <w:jc w:val="left"/>
+      </w:pPr>
+      <w:r>
+        <w:rPr>
+          <w:rFonts w:ascii="Calibri" w:cs="Calibri" w:eastAsia="Calibri" w:hAnsi="Calibri"/>
+          <w:sz w:val="22"/>
+          <w:szCs w:val="22"/>
+        </w:rPr>
+        <w:t xml:space="preserve">Все 9 попали в топ-10 (Hit Rate 100%). Diversity@10 у российских профилей выше (0.079 vs 0.035) — система рекомендует более разнообразный географический микс.</w:t>
+      </w:r>
+    </w:p>
+    <w:p>
+      <w:pPr>
+        <w:pStyle w:val="Heading3"/>
+        <w:spacing w:after="80" w:before="180"/>
+      </w:pPr>
+      <w:r>
+        <w:rPr>
+          <w:rFonts w:ascii="Calibri" w:cs="Calibri" w:eastAsia="Calibri" w:hAnsi="Calibri"/>
+          <w:b/>
+          <w:bCs/>
+          <w:color w:val="2F5496"/>
+          <w:sz w:val="24"/>
+          <w:szCs w:val="24"/>
+        </w:rPr>
+        <w:t xml:space="preserve">Два промаха (из базовых профилей)</w:t>
+      </w:r>
+    </w:p>
+    <w:p>
+      <w:pPr>
+        <w:pStyle w:val="ListParagraph"/>
+        <w:numPr>
+          <w:ilvl w:val="0"/>
+          <w:numId w:val="2"/>
+        </w:numPr>
+        <w:spacing w:after="60"/>
+      </w:pPr>
+      <w:r>
+        <w:rPr>
+          <w:rFonts w:ascii="Calibri" w:cs="Calibri" w:eastAsia="Calibri" w:hAnsi="Calibri"/>
+          <w:sz w:val="22"/>
+          <w:szCs w:val="22"/>
+        </w:rPr>
+        <w:t xml:space="preserve">POL (Польша) — вытесняется соседями (Чехия, Венгрия) с более выгодным профилем</w:t>
+      </w:r>
+    </w:p>
+    <w:p>
+      <w:pPr>
+        <w:pStyle w:val="ListParagraph"/>
+        <w:numPr>
+          <w:ilvl w:val="0"/>
+          <w:numId w:val="2"/>
+        </w:numPr>
+        <w:spacing w:after="60"/>
+      </w:pPr>
+      <w:r>
+        <w:rPr>
+          <w:rFonts w:ascii="Calibri" w:cs="Calibri" w:eastAsia="Calibri" w:hAnsi="Calibri"/>
+          <w:sz w:val="22"/>
+          <w:szCs w:val="22"/>
+        </w:rPr>
         <w:t xml:space="preserve">IND (Индия) — низкий бюджет $1500 + плохое здравоохранение + загрязнение уводят за топ-10</w:t>
       </w:r>
     </w:p>
@@ -9466,7 +10810,7 @@
           <w:sz w:val="22"/>
           <w:szCs w:val="22"/>
         </w:rPr>
-        <w:t xml:space="preserve">Интересный артефакт: шумные профили дали NDCG чуть выше чистых (0.8037 vs 0.7775). Гипотеза: шум "смягчает" острые веса, что иногда улучшает косинусное сходство.</w:t>
+        <w:t xml:space="preserve">Интересный артефакт: российские профили показали более высокое Diversity@10 (0.079), чем базовые (0.035–0.050). Это связано с тем, что дружественных стран много и они географически разнообразны: Кавказ, Балканы, Ближний Восток, ЮВА, Латинская Америка.</w:t>
       </w:r>
     </w:p>
     <w:p>
@@ -11148,7 +12492,7 @@
           <w:sz w:val="36"/>
           <w:szCs w:val="36"/>
         </w:rPr>
-        <w:t xml:space="preserve">12. Итоги и дальнейшие улучшения</w:t>
+        <w:t xml:space="preserve">12. Адаптация для россиян</w:t>
       </w:r>
     </w:p>
     <w:p>
@@ -11165,7 +12509,1878 @@
           <w:sz w:val="28"/>
           <w:szCs w:val="28"/>
         </w:rPr>
-        <w:t xml:space="preserve">12.1. Что получилось</w:t>
+        <w:t xml:space="preserve">12.1. Контекст</w:t>
+      </w:r>
+    </w:p>
+    <w:p>
+      <w:pPr>
+        <w:spacing w:after="120" w:line="300"/>
+        <w:jc w:val="left"/>
+      </w:pPr>
+      <w:r>
+        <w:rPr>
+          <w:rFonts w:ascii="Calibri" w:cs="Calibri" w:eastAsia="Calibri" w:hAnsi="Calibri"/>
+          <w:sz w:val="22"/>
+          <w:szCs w:val="22"/>
+        </w:rPr>
+        <w:t xml:space="preserve">С 2022 года граждане РФ столкнулись с уникальными ограничениями при эмиграции, не отражёнными в стандартных международных рейтингах. Стандартный recommender не учитывал, что для человека с паспортом РФ разница между Грузией и Германией — не только в стоимости жизни, но и в возможности въехать, открыть счёт, получить ВНЖ без санкционных последствий.</w:t>
+      </w:r>
+    </w:p>
+    <w:p>
+      <w:pPr>
+        <w:pStyle w:val="Heading2"/>
+        <w:spacing w:after="120" w:before="240"/>
+      </w:pPr>
+      <w:r>
+        <w:rPr>
+          <w:rFonts w:ascii="Calibri" w:cs="Calibri" w:eastAsia="Calibri" w:hAnsi="Calibri"/>
+          <w:b/>
+          <w:bCs/>
+          <w:color w:val="1F4E79"/>
+          <w:sz w:val="28"/>
+          <w:szCs w:val="28"/>
+        </w:rPr>
+        <w:t xml:space="preserve">12.2. Три новых признака</w:t>
+      </w:r>
+    </w:p>
+    <w:tbl>
+      <w:tblPr>
+        <w:tblW w:type="dxa" w:w="9400"/>
+        <w:tblBorders>
+          <w:top w:val="single" w:color="auto" w:sz="4"/>
+          <w:left w:val="single" w:color="auto" w:sz="4"/>
+          <w:bottom w:val="single" w:color="auto" w:sz="4"/>
+          <w:right w:val="single" w:color="auto" w:sz="4"/>
+          <w:insideH w:val="single" w:color="auto" w:sz="4"/>
+          <w:insideV w:val="single" w:color="auto" w:sz="4"/>
+        </w:tblBorders>
+      </w:tblPr>
+      <w:tblGrid>
+        <w:gridCol w:w="2600"/>
+        <w:gridCol w:w="1600"/>
+        <w:gridCol w:w="2800"/>
+        <w:gridCol w:w="2400"/>
+      </w:tblGrid>
+      <w:tr>
+        <w:tc>
+          <w:tcPr>
+            <w:tcW w:type="dxa" w:w="2600"/>
+            <w:tcBorders>
+              <w:top w:val="single" w:color="CCCCCC" w:sz="4"/>
+              <w:left w:val="single" w:color="CCCCCC" w:sz="4"/>
+              <w:bottom w:val="single" w:color="CCCCCC" w:sz="4"/>
+              <w:right w:val="single" w:color="CCCCCC" w:sz="4"/>
+            </w:tcBorders>
+            <w:shd w:fill="1F4E79" w:val="clear"/>
+            <w:tcMar>
+              <w:top w:type="dxa" w:w="80"/>
+              <w:left w:type="dxa" w:w="120"/>
+              <w:bottom w:type="dxa" w:w="80"/>
+              <w:right w:type="dxa" w:w="120"/>
+            </w:tcMar>
+          </w:tcPr>
+          <w:p>
+            <w:pPr>
+              <w:jc w:val="left"/>
+            </w:pPr>
+            <w:r>
+              <w:rPr>
+                <w:rFonts w:ascii="Calibri" w:cs="Calibri" w:eastAsia="Calibri" w:hAnsi="Calibri"/>
+                <w:b/>
+                <w:bCs/>
+                <w:color w:val="FFFFFF"/>
+                <w:sz w:val="20"/>
+                <w:szCs w:val="20"/>
+              </w:rPr>
+              <w:t xml:space="preserve">Признак</w:t>
+            </w:r>
+          </w:p>
+        </w:tc>
+        <w:tc>
+          <w:tcPr>
+            <w:tcW w:type="dxa" w:w="1600"/>
+            <w:tcBorders>
+              <w:top w:val="single" w:color="CCCCCC" w:sz="4"/>
+              <w:left w:val="single" w:color="CCCCCC" w:sz="4"/>
+              <w:bottom w:val="single" w:color="CCCCCC" w:sz="4"/>
+              <w:right w:val="single" w:color="CCCCCC" w:sz="4"/>
+            </w:tcBorders>
+            <w:shd w:fill="1F4E79" w:val="clear"/>
+            <w:tcMar>
+              <w:top w:type="dxa" w:w="80"/>
+              <w:left w:type="dxa" w:w="120"/>
+              <w:bottom w:type="dxa" w:w="80"/>
+              <w:right w:type="dxa" w:w="120"/>
+            </w:tcMar>
+          </w:tcPr>
+          <w:p>
+            <w:pPr>
+              <w:jc w:val="center"/>
+            </w:pPr>
+            <w:r>
+              <w:rPr>
+                <w:rFonts w:ascii="Calibri" w:cs="Calibri" w:eastAsia="Calibri" w:hAnsi="Calibri"/>
+                <w:b/>
+                <w:bCs/>
+                <w:color w:val="FFFFFF"/>
+                <w:sz w:val="20"/>
+                <w:szCs w:val="20"/>
+              </w:rPr>
+              <w:t xml:space="preserve">Диапазон</w:t>
+            </w:r>
+          </w:p>
+        </w:tc>
+        <w:tc>
+          <w:tcPr>
+            <w:tcW w:type="dxa" w:w="2800"/>
+            <w:tcBorders>
+              <w:top w:val="single" w:color="CCCCCC" w:sz="4"/>
+              <w:left w:val="single" w:color="CCCCCC" w:sz="4"/>
+              <w:bottom w:val="single" w:color="CCCCCC" w:sz="4"/>
+              <w:right w:val="single" w:color="CCCCCC" w:sz="4"/>
+            </w:tcBorders>
+            <w:shd w:fill="1F4E79" w:val="clear"/>
+            <w:tcMar>
+              <w:top w:type="dxa" w:w="80"/>
+              <w:left w:type="dxa" w:w="120"/>
+              <w:bottom w:type="dxa" w:w="80"/>
+              <w:right w:type="dxa" w:w="120"/>
+            </w:tcMar>
+          </w:tcPr>
+          <w:p>
+            <w:pPr>
+              <w:jc w:val="center"/>
+            </w:pPr>
+            <w:r>
+              <w:rPr>
+                <w:rFonts w:ascii="Calibri" w:cs="Calibri" w:eastAsia="Calibri" w:hAnsi="Calibri"/>
+                <w:b/>
+                <w:bCs/>
+                <w:color w:val="FFFFFF"/>
+                <w:sz w:val="20"/>
+                <w:szCs w:val="20"/>
+              </w:rPr>
+              <w:t xml:space="preserve">Вес в модели</w:t>
+            </w:r>
+          </w:p>
+        </w:tc>
+        <w:tc>
+          <w:tcPr>
+            <w:tcW w:type="dxa" w:w="2400"/>
+            <w:tcBorders>
+              <w:top w:val="single" w:color="CCCCCC" w:sz="4"/>
+              <w:left w:val="single" w:color="CCCCCC" w:sz="4"/>
+              <w:bottom w:val="single" w:color="CCCCCC" w:sz="4"/>
+              <w:right w:val="single" w:color="CCCCCC" w:sz="4"/>
+            </w:tcBorders>
+            <w:shd w:fill="1F4E79" w:val="clear"/>
+            <w:tcMar>
+              <w:top w:type="dxa" w:w="80"/>
+              <w:left w:type="dxa" w:w="120"/>
+              <w:bottom w:type="dxa" w:w="80"/>
+              <w:right w:type="dxa" w:w="120"/>
+            </w:tcMar>
+          </w:tcPr>
+          <w:p>
+            <w:pPr>
+              <w:jc w:val="center"/>
+            </w:pPr>
+            <w:r>
+              <w:rPr>
+                <w:rFonts w:ascii="Calibri" w:cs="Calibri" w:eastAsia="Calibri" w:hAnsi="Calibri"/>
+                <w:b/>
+                <w:bCs/>
+                <w:color w:val="FFFFFF"/>
+                <w:sz w:val="20"/>
+                <w:szCs w:val="20"/>
+              </w:rPr>
+              <w:t xml:space="preserve">Примеры (лучшие)</w:t>
+            </w:r>
+          </w:p>
+        </w:tc>
+      </w:tr>
+      <w:tr>
+        <w:tc>
+          <w:tcPr>
+            <w:tcW w:type="dxa" w:w="2600"/>
+            <w:tcBorders>
+              <w:top w:val="single" w:color="CCCCCC" w:sz="4"/>
+              <w:left w:val="single" w:color="CCCCCC" w:sz="4"/>
+              <w:bottom w:val="single" w:color="CCCCCC" w:sz="4"/>
+              <w:right w:val="single" w:color="CCCCCC" w:sz="4"/>
+            </w:tcBorders>
+            <w:tcMar>
+              <w:top w:type="dxa" w:w="80"/>
+              <w:left w:type="dxa" w:w="120"/>
+              <w:bottom w:type="dxa" w:w="80"/>
+              <w:right w:type="dxa" w:w="120"/>
+            </w:tcMar>
+          </w:tcPr>
+          <w:p>
+            <w:pPr>
+              <w:jc w:val="left"/>
+            </w:pPr>
+            <w:r>
+              <w:rPr>
+                <w:rFonts w:ascii="Calibri" w:cs="Calibri" w:eastAsia="Calibri" w:hAnsi="Calibri"/>
+                <w:color w:val="000000"/>
+                <w:sz w:val="20"/>
+                <w:szCs w:val="20"/>
+              </w:rPr>
+              <w:t xml:space="preserve">ru_visa_free</w:t>
+            </w:r>
+          </w:p>
+        </w:tc>
+        <w:tc>
+          <w:tcPr>
+            <w:tcW w:type="dxa" w:w="1600"/>
+            <w:tcBorders>
+              <w:top w:val="single" w:color="CCCCCC" w:sz="4"/>
+              <w:left w:val="single" w:color="CCCCCC" w:sz="4"/>
+              <w:bottom w:val="single" w:color="CCCCCC" w:sz="4"/>
+              <w:right w:val="single" w:color="CCCCCC" w:sz="4"/>
+            </w:tcBorders>
+            <w:tcMar>
+              <w:top w:type="dxa" w:w="80"/>
+              <w:left w:type="dxa" w:w="120"/>
+              <w:bottom w:type="dxa" w:w="80"/>
+              <w:right w:type="dxa" w:w="120"/>
+            </w:tcMar>
+          </w:tcPr>
+          <w:p>
+            <w:pPr>
+              <w:jc w:val="center"/>
+            </w:pPr>
+            <w:r>
+              <w:rPr>
+                <w:rFonts w:ascii="Calibri" w:cs="Calibri" w:eastAsia="Calibri" w:hAnsi="Calibri"/>
+                <w:color w:val="000000"/>
+                <w:sz w:val="20"/>
+                <w:szCs w:val="20"/>
+              </w:rPr>
+              <w:t xml:space="preserve">0 / 1</w:t>
+            </w:r>
+          </w:p>
+        </w:tc>
+        <w:tc>
+          <w:tcPr>
+            <w:tcW w:type="dxa" w:w="2800"/>
+            <w:tcBorders>
+              <w:top w:val="single" w:color="CCCCCC" w:sz="4"/>
+              <w:left w:val="single" w:color="CCCCCC" w:sz="4"/>
+              <w:bottom w:val="single" w:color="CCCCCC" w:sz="4"/>
+              <w:right w:val="single" w:color="CCCCCC" w:sz="4"/>
+            </w:tcBorders>
+            <w:tcMar>
+              <w:top w:type="dxa" w:w="80"/>
+              <w:left w:type="dxa" w:w="120"/>
+              <w:bottom w:type="dxa" w:w="80"/>
+              <w:right w:type="dxa" w:w="120"/>
+            </w:tcMar>
+          </w:tcPr>
+          <w:p>
+            <w:pPr>
+              <w:jc w:val="center"/>
+            </w:pPr>
+            <w:r>
+              <w:rPr>
+                <w:rFonts w:ascii="Calibri" w:cs="Calibri" w:eastAsia="Calibri" w:hAnsi="Calibri"/>
+                <w:color w:val="000000"/>
+                <w:sz w:val="20"/>
+                <w:szCs w:val="20"/>
+              </w:rPr>
+              <w:t xml:space="preserve">+0.08 бонус</w:t>
+            </w:r>
+          </w:p>
+        </w:tc>
+        <w:tc>
+          <w:tcPr>
+            <w:tcW w:type="dxa" w:w="2400"/>
+            <w:tcBorders>
+              <w:top w:val="single" w:color="CCCCCC" w:sz="4"/>
+              <w:left w:val="single" w:color="CCCCCC" w:sz="4"/>
+              <w:bottom w:val="single" w:color="CCCCCC" w:sz="4"/>
+              <w:right w:val="single" w:color="CCCCCC" w:sz="4"/>
+            </w:tcBorders>
+            <w:tcMar>
+              <w:top w:type="dxa" w:w="80"/>
+              <w:left w:type="dxa" w:w="120"/>
+              <w:bottom w:type="dxa" w:w="80"/>
+              <w:right w:type="dxa" w:w="120"/>
+            </w:tcMar>
+          </w:tcPr>
+          <w:p>
+            <w:pPr>
+              <w:jc w:val="center"/>
+            </w:pPr>
+            <w:r>
+              <w:rPr>
+                <w:rFonts w:ascii="Calibri" w:cs="Calibri" w:eastAsia="Calibri" w:hAnsi="Calibri"/>
+                <w:color w:val="000000"/>
+                <w:sz w:val="20"/>
+                <w:szCs w:val="20"/>
+              </w:rPr>
+              <w:t xml:space="preserve">GEO, ARM, SRB, TUR, ARE, THA, LatAm</w:t>
+            </w:r>
+          </w:p>
+        </w:tc>
+      </w:tr>
+      <w:tr>
+        <w:tc>
+          <w:tcPr>
+            <w:tcW w:type="dxa" w:w="2600"/>
+            <w:tcBorders>
+              <w:top w:val="single" w:color="CCCCCC" w:sz="4"/>
+              <w:left w:val="single" w:color="CCCCCC" w:sz="4"/>
+              <w:bottom w:val="single" w:color="CCCCCC" w:sz="4"/>
+              <w:right w:val="single" w:color="CCCCCC" w:sz="4"/>
+            </w:tcBorders>
+            <w:shd w:fill="D5E8F0" w:val="clear"/>
+            <w:tcMar>
+              <w:top w:type="dxa" w:w="80"/>
+              <w:left w:type="dxa" w:w="120"/>
+              <w:bottom w:type="dxa" w:w="80"/>
+              <w:right w:type="dxa" w:w="120"/>
+            </w:tcMar>
+          </w:tcPr>
+          <w:p>
+            <w:pPr>
+              <w:jc w:val="left"/>
+            </w:pPr>
+            <w:r>
+              <w:rPr>
+                <w:rFonts w:ascii="Calibri" w:cs="Calibri" w:eastAsia="Calibri" w:hAnsi="Calibri"/>
+                <w:color w:val="000000"/>
+                <w:sz w:val="20"/>
+                <w:szCs w:val="20"/>
+              </w:rPr>
+              <w:t xml:space="preserve">ru_banking_access</w:t>
+            </w:r>
+          </w:p>
+        </w:tc>
+        <w:tc>
+          <w:tcPr>
+            <w:tcW w:type="dxa" w:w="1600"/>
+            <w:tcBorders>
+              <w:top w:val="single" w:color="CCCCCC" w:sz="4"/>
+              <w:left w:val="single" w:color="CCCCCC" w:sz="4"/>
+              <w:bottom w:val="single" w:color="CCCCCC" w:sz="4"/>
+              <w:right w:val="single" w:color="CCCCCC" w:sz="4"/>
+            </w:tcBorders>
+            <w:shd w:fill="D5E8F0" w:val="clear"/>
+            <w:tcMar>
+              <w:top w:type="dxa" w:w="80"/>
+              <w:left w:type="dxa" w:w="120"/>
+              <w:bottom w:type="dxa" w:w="80"/>
+              <w:right w:type="dxa" w:w="120"/>
+            </w:tcMar>
+          </w:tcPr>
+          <w:p>
+            <w:pPr>
+              <w:jc w:val="center"/>
+            </w:pPr>
+            <w:r>
+              <w:rPr>
+                <w:rFonts w:ascii="Calibri" w:cs="Calibri" w:eastAsia="Calibri" w:hAnsi="Calibri"/>
+                <w:color w:val="000000"/>
+                <w:sz w:val="20"/>
+                <w:szCs w:val="20"/>
+              </w:rPr>
+              <w:t xml:space="preserve">1–5 → [0,1]</w:t>
+            </w:r>
+          </w:p>
+        </w:tc>
+        <w:tc>
+          <w:tcPr>
+            <w:tcW w:type="dxa" w:w="2800"/>
+            <w:tcBorders>
+              <w:top w:val="single" w:color="CCCCCC" w:sz="4"/>
+              <w:left w:val="single" w:color="CCCCCC" w:sz="4"/>
+              <w:bottom w:val="single" w:color="CCCCCC" w:sz="4"/>
+              <w:right w:val="single" w:color="CCCCCC" w:sz="4"/>
+            </w:tcBorders>
+            <w:shd w:fill="D5E8F0" w:val="clear"/>
+            <w:tcMar>
+              <w:top w:type="dxa" w:w="80"/>
+              <w:left w:type="dxa" w:w="120"/>
+              <w:bottom w:type="dxa" w:w="80"/>
+              <w:right w:type="dxa" w:w="120"/>
+            </w:tcMar>
+          </w:tcPr>
+          <w:p>
+            <w:pPr>
+              <w:jc w:val="center"/>
+            </w:pPr>
+            <w:r>
+              <w:rPr>
+                <w:rFonts w:ascii="Calibri" w:cs="Calibri" w:eastAsia="Calibri" w:hAnsi="Calibri"/>
+                <w:color w:val="000000"/>
+                <w:sz w:val="20"/>
+                <w:szCs w:val="20"/>
+              </w:rPr>
+              <w:t xml:space="preserve">+0.04 × val (если нужен счёт)</w:t>
+            </w:r>
+          </w:p>
+        </w:tc>
+        <w:tc>
+          <w:tcPr>
+            <w:tcW w:type="dxa" w:w="2400"/>
+            <w:tcBorders>
+              <w:top w:val="single" w:color="CCCCCC" w:sz="4"/>
+              <w:left w:val="single" w:color="CCCCCC" w:sz="4"/>
+              <w:bottom w:val="single" w:color="CCCCCC" w:sz="4"/>
+              <w:right w:val="single" w:color="CCCCCC" w:sz="4"/>
+            </w:tcBorders>
+            <w:shd w:fill="D5E8F0" w:val="clear"/>
+            <w:tcMar>
+              <w:top w:type="dxa" w:w="80"/>
+              <w:left w:type="dxa" w:w="120"/>
+              <w:bottom w:type="dxa" w:w="80"/>
+              <w:right w:type="dxa" w:w="120"/>
+            </w:tcMar>
+          </w:tcPr>
+          <w:p>
+            <w:pPr>
+              <w:jc w:val="center"/>
+            </w:pPr>
+            <w:r>
+              <w:rPr>
+                <w:rFonts w:ascii="Calibri" w:cs="Calibri" w:eastAsia="Calibri" w:hAnsi="Calibri"/>
+                <w:color w:val="000000"/>
+                <w:sz w:val="20"/>
+                <w:szCs w:val="20"/>
+              </w:rPr>
+              <w:t xml:space="preserve">ARM (5), GEO (5), SRB (5), TUR (4)</w:t>
+            </w:r>
+          </w:p>
+        </w:tc>
+      </w:tr>
+      <w:tr>
+        <w:tc>
+          <w:tcPr>
+            <w:tcW w:type="dxa" w:w="2600"/>
+            <w:tcBorders>
+              <w:top w:val="single" w:color="CCCCCC" w:sz="4"/>
+              <w:left w:val="single" w:color="CCCCCC" w:sz="4"/>
+              <w:bottom w:val="single" w:color="CCCCCC" w:sz="4"/>
+              <w:right w:val="single" w:color="CCCCCC" w:sz="4"/>
+            </w:tcBorders>
+            <w:tcMar>
+              <w:top w:type="dxa" w:w="80"/>
+              <w:left w:type="dxa" w:w="120"/>
+              <w:bottom w:type="dxa" w:w="80"/>
+              <w:right w:type="dxa" w:w="120"/>
+            </w:tcMar>
+          </w:tcPr>
+          <w:p>
+            <w:pPr>
+              <w:jc w:val="left"/>
+            </w:pPr>
+            <w:r>
+              <w:rPr>
+                <w:rFonts w:ascii="Calibri" w:cs="Calibri" w:eastAsia="Calibri" w:hAnsi="Calibri"/>
+                <w:color w:val="000000"/>
+                <w:sz w:val="20"/>
+                <w:szCs w:val="20"/>
+              </w:rPr>
+              <w:t xml:space="preserve">ru_sanctions_risk</w:t>
+            </w:r>
+          </w:p>
+        </w:tc>
+        <w:tc>
+          <w:tcPr>
+            <w:tcW w:type="dxa" w:w="1600"/>
+            <w:tcBorders>
+              <w:top w:val="single" w:color="CCCCCC" w:sz="4"/>
+              <w:left w:val="single" w:color="CCCCCC" w:sz="4"/>
+              <w:bottom w:val="single" w:color="CCCCCC" w:sz="4"/>
+              <w:right w:val="single" w:color="CCCCCC" w:sz="4"/>
+            </w:tcBorders>
+            <w:tcMar>
+              <w:top w:type="dxa" w:w="80"/>
+              <w:left w:type="dxa" w:w="120"/>
+              <w:bottom w:type="dxa" w:w="80"/>
+              <w:right w:type="dxa" w:w="120"/>
+            </w:tcMar>
+          </w:tcPr>
+          <w:p>
+            <w:pPr>
+              <w:jc w:val="center"/>
+            </w:pPr>
+            <w:r>
+              <w:rPr>
+                <w:rFonts w:ascii="Calibri" w:cs="Calibri" w:eastAsia="Calibri" w:hAnsi="Calibri"/>
+                <w:color w:val="000000"/>
+                <w:sz w:val="20"/>
+                <w:szCs w:val="20"/>
+              </w:rPr>
+              <w:t xml:space="preserve">1–3 → [0,1]</w:t>
+            </w:r>
+          </w:p>
+        </w:tc>
+        <w:tc>
+          <w:tcPr>
+            <w:tcW w:type="dxa" w:w="2800"/>
+            <w:tcBorders>
+              <w:top w:val="single" w:color="CCCCCC" w:sz="4"/>
+              <w:left w:val="single" w:color="CCCCCC" w:sz="4"/>
+              <w:bottom w:val="single" w:color="CCCCCC" w:sz="4"/>
+              <w:right w:val="single" w:color="CCCCCC" w:sz="4"/>
+            </w:tcBorders>
+            <w:tcMar>
+              <w:top w:type="dxa" w:w="80"/>
+              <w:left w:type="dxa" w:w="120"/>
+              <w:bottom w:type="dxa" w:w="80"/>
+              <w:right w:type="dxa" w:w="120"/>
+            </w:tcMar>
+          </w:tcPr>
+          <w:p>
+            <w:pPr>
+              <w:jc w:val="center"/>
+            </w:pPr>
+            <w:r>
+              <w:rPr>
+                <w:rFonts w:ascii="Calibri" w:cs="Calibri" w:eastAsia="Calibri" w:hAnsi="Calibri"/>
+                <w:color w:val="000000"/>
+                <w:sz w:val="20"/>
+                <w:szCs w:val="20"/>
+              </w:rPr>
+              <w:t xml:space="preserve">−0.06 × risk (инвертирован)</w:t>
+            </w:r>
+          </w:p>
+        </w:tc>
+        <w:tc>
+          <w:tcPr>
+            <w:tcW w:type="dxa" w:w="2400"/>
+            <w:tcBorders>
+              <w:top w:val="single" w:color="CCCCCC" w:sz="4"/>
+              <w:left w:val="single" w:color="CCCCCC" w:sz="4"/>
+              <w:bottom w:val="single" w:color="CCCCCC" w:sz="4"/>
+              <w:right w:val="single" w:color="CCCCCC" w:sz="4"/>
+            </w:tcBorders>
+            <w:tcMar>
+              <w:top w:type="dxa" w:w="80"/>
+              <w:left w:type="dxa" w:w="120"/>
+              <w:bottom w:type="dxa" w:w="80"/>
+              <w:right w:type="dxa" w:w="120"/>
+            </w:tcMar>
+          </w:tcPr>
+          <w:p>
+            <w:pPr>
+              <w:jc w:val="center"/>
+            </w:pPr>
+            <w:r>
+              <w:rPr>
+                <w:rFonts w:ascii="Calibri" w:cs="Calibri" w:eastAsia="Calibri" w:hAnsi="Calibri"/>
+                <w:color w:val="000000"/>
+                <w:sz w:val="20"/>
+                <w:szCs w:val="20"/>
+              </w:rPr>
+              <w:t xml:space="preserve">GEO, SRB, THA = 1; EU, USA, GBR = 3</w:t>
+            </w:r>
+          </w:p>
+        </w:tc>
+      </w:tr>
+    </w:tbl>
+    <w:p>
+      <w:pPr>
+        <w:pStyle w:val="Heading2"/>
+        <w:spacing w:after="120" w:before="240"/>
+      </w:pPr>
+      <w:r>
+        <w:rPr>
+          <w:rFonts w:ascii="Calibri" w:cs="Calibri" w:eastAsia="Calibri" w:hAnsi="Calibri"/>
+          <w:b/>
+          <w:bCs/>
+          <w:color w:val="1F4E79"/>
+          <w:sz w:val="28"/>
+          <w:szCs w:val="28"/>
+        </w:rPr>
+        <w:t xml:space="preserve">12.3. Логика бонусов в recommend()</w:t>
+      </w:r>
+    </w:p>
+    <w:p>
+      <w:pPr>
+        <w:shd w:fill="F2F2F2" w:val="clear"/>
+        <w:spacing w:after="0" w:line="260"/>
+      </w:pPr>
+      <w:r>
+        <w:rPr>
+          <w:rFonts w:ascii="Consolas" w:cs="Consolas" w:eastAsia="Consolas" w:hAnsi="Consolas"/>
+          <w:color w:val="1F2937"/>
+          <w:sz w:val="18"/>
+          <w:szCs w:val="18"/>
+        </w:rPr>
+        <w:t xml:space="preserve">if profile.user_is_russian:</w:t>
+      </w:r>
+    </w:p>
+    <w:p>
+      <w:pPr>
+        <w:shd w:fill="F2F2F2" w:val="clear"/>
+        <w:spacing w:after="0" w:line="260"/>
+      </w:pPr>
+      <w:r>
+        <w:rPr>
+          <w:rFonts w:ascii="Consolas" w:cs="Consolas" w:eastAsia="Consolas" w:hAnsi="Consolas"/>
+          <w:color w:val="1F2937"/>
+          <w:sz w:val="18"/>
+          <w:szCs w:val="18"/>
+        </w:rPr>
+        <w:t xml:space="preserve">    # +0.08 за безвизовый въезд</w:t>
+      </w:r>
+    </w:p>
+    <w:p>
+      <w:pPr>
+        <w:shd w:fill="F2F2F2" w:val="clear"/>
+        <w:spacing w:after="0" w:line="260"/>
+      </w:pPr>
+      <w:r>
+        <w:rPr>
+          <w:rFonts w:ascii="Consolas" w:cs="Consolas" w:eastAsia="Consolas" w:hAnsi="Consolas"/>
+          <w:color w:val="1F2937"/>
+          <w:sz w:val="18"/>
+          <w:szCs w:val="18"/>
+        </w:rPr>
+        <w:t xml:space="preserve">    ru_visa_bonus = where(ru_visa_free &gt; 0.5, +0.08, 0)</w:t>
+      </w:r>
+    </w:p>
+    <w:p>
+      <w:pPr>
+        <w:shd w:fill="F2F2F2" w:val="clear"/>
+        <w:spacing w:after="0" w:line="260"/>
+      </w:pPr>
+      <w:r>
+        <w:rPr>
+          <w:rFonts w:ascii="Consolas" w:cs="Consolas" w:eastAsia="Consolas" w:hAnsi="Consolas"/>
+          <w:color w:val="1F2937"/>
+          <w:sz w:val="18"/>
+          <w:szCs w:val="18"/>
+        </w:rPr>
+        <w:t xml:space="preserve"> </w:t>
+      </w:r>
+    </w:p>
+    <w:p>
+      <w:pPr>
+        <w:shd w:fill="F2F2F2" w:val="clear"/>
+        <w:spacing w:after="0" w:line="260"/>
+      </w:pPr>
+      <w:r>
+        <w:rPr>
+          <w:rFonts w:ascii="Consolas" w:cs="Consolas" w:eastAsia="Consolas" w:hAnsi="Consolas"/>
+          <w:color w:val="1F2937"/>
+          <w:sz w:val="18"/>
+          <w:szCs w:val="18"/>
+        </w:rPr>
+        <w:t xml:space="preserve">    # -0.04 за Шенген без визы (снимается при has_eu_visa=True)</w:t>
+      </w:r>
+    </w:p>
+    <w:p>
+      <w:pPr>
+        <w:shd w:fill="F2F2F2" w:val="clear"/>
+        <w:spacing w:after="0" w:line="260"/>
+      </w:pPr>
+      <w:r>
+        <w:rPr>
+          <w:rFonts w:ascii="Consolas" w:cs="Consolas" w:eastAsia="Consolas" w:hAnsi="Consolas"/>
+          <w:color w:val="1F2937"/>
+          <w:sz w:val="18"/>
+          <w:szCs w:val="18"/>
+        </w:rPr>
+        <w:t xml:space="preserve">    if not profile.has_eu_visa:</w:t>
+      </w:r>
+    </w:p>
+    <w:p>
+      <w:pPr>
+        <w:shd w:fill="F2F2F2" w:val="clear"/>
+        <w:spacing w:after="0" w:line="260"/>
+      </w:pPr>
+      <w:r>
+        <w:rPr>
+          <w:rFonts w:ascii="Consolas" w:cs="Consolas" w:eastAsia="Consolas" w:hAnsi="Consolas"/>
+          <w:color w:val="1F2937"/>
+          <w:sz w:val="18"/>
+          <w:szCs w:val="18"/>
+        </w:rPr>
+        <w:t xml:space="preserve">        ru_visa_bonus += where(schengen &amp; ~ru_visa_free, -0.04, 0)</w:t>
+      </w:r>
+    </w:p>
+    <w:p>
+      <w:pPr>
+        <w:shd w:fill="F2F2F2" w:val="clear"/>
+        <w:spacing w:after="0" w:line="260"/>
+      </w:pPr>
+      <w:r>
+        <w:rPr>
+          <w:rFonts w:ascii="Consolas" w:cs="Consolas" w:eastAsia="Consolas" w:hAnsi="Consolas"/>
+          <w:color w:val="1F2937"/>
+          <w:sz w:val="18"/>
+          <w:szCs w:val="18"/>
+        </w:rPr>
+        <w:t xml:space="preserve"> </w:t>
+      </w:r>
+    </w:p>
+    <w:p>
+      <w:pPr>
+        <w:shd w:fill="F2F2F2" w:val="clear"/>
+        <w:spacing w:after="0" w:line="260"/>
+      </w:pPr>
+      <w:r>
+        <w:rPr>
+          <w:rFonts w:ascii="Consolas" w:cs="Consolas" w:eastAsia="Consolas" w:hAnsi="Consolas"/>
+          <w:color w:val="1F2937"/>
+          <w:sz w:val="18"/>
+          <w:szCs w:val="18"/>
+        </w:rPr>
+        <w:t xml:space="preserve">    # санкционный штраф: -0.06 × risk (0–1 после MinMax)</w:t>
+      </w:r>
+    </w:p>
+    <w:p>
+      <w:pPr>
+        <w:shd w:fill="F2F2F2" w:val="clear"/>
+        <w:spacing w:after="0" w:line="260"/>
+      </w:pPr>
+      <w:r>
+        <w:rPr>
+          <w:rFonts w:ascii="Consolas" w:cs="Consolas" w:eastAsia="Consolas" w:hAnsi="Consolas"/>
+          <w:color w:val="1F2937"/>
+          <w:sz w:val="18"/>
+          <w:szCs w:val="18"/>
+        </w:rPr>
+        <w:t xml:space="preserve">    ru_sanctions_penalty = -0.06 × ru_sanctions_risk</w:t>
+      </w:r>
+    </w:p>
+    <w:p>
+      <w:pPr>
+        <w:shd w:fill="F2F2F2" w:val="clear"/>
+        <w:spacing w:after="0" w:line="260"/>
+      </w:pPr>
+      <w:r>
+        <w:rPr>
+          <w:rFonts w:ascii="Consolas" w:cs="Consolas" w:eastAsia="Consolas" w:hAnsi="Consolas"/>
+          <w:color w:val="1F2937"/>
+          <w:sz w:val="18"/>
+          <w:szCs w:val="18"/>
+        </w:rPr>
+        <w:t xml:space="preserve"> </w:t>
+      </w:r>
+    </w:p>
+    <w:p>
+      <w:pPr>
+        <w:shd w:fill="F2F2F2" w:val="clear"/>
+        <w:spacing w:after="0" w:line="260"/>
+      </w:pPr>
+      <w:r>
+        <w:rPr>
+          <w:rFonts w:ascii="Consolas" w:cs="Consolas" w:eastAsia="Consolas" w:hAnsi="Consolas"/>
+          <w:color w:val="1F2937"/>
+          <w:sz w:val="18"/>
+          <w:szCs w:val="18"/>
+        </w:rPr>
+        <w:t xml:space="preserve">    # банкинг: +0.04 × access (если needs_banking_access)</w:t>
+      </w:r>
+    </w:p>
+    <w:p>
+      <w:pPr>
+        <w:shd w:fill="F2F2F2" w:val="clear"/>
+        <w:spacing w:after="0" w:line="260"/>
+      </w:pPr>
+      <w:r>
+        <w:rPr>
+          <w:rFonts w:ascii="Consolas" w:cs="Consolas" w:eastAsia="Consolas" w:hAnsi="Consolas"/>
+          <w:color w:val="1F2937"/>
+          <w:sz w:val="18"/>
+          <w:szCs w:val="18"/>
+        </w:rPr>
+        <w:t xml:space="preserve">    if profile.needs_banking_access:</w:t>
+      </w:r>
+    </w:p>
+    <w:p>
+      <w:pPr>
+        <w:shd w:fill="F2F2F2" w:val="clear"/>
+        <w:spacing w:after="0" w:line="260"/>
+      </w:pPr>
+      <w:r>
+        <w:rPr>
+          <w:rFonts w:ascii="Consolas" w:cs="Consolas" w:eastAsia="Consolas" w:hAnsi="Consolas"/>
+          <w:color w:val="1F2937"/>
+          <w:sz w:val="18"/>
+          <w:szCs w:val="18"/>
+        </w:rPr>
+        <w:t xml:space="preserve">        ru_banking_bonus = +0.04 × ru_banking_access</w:t>
+      </w:r>
+    </w:p>
+    <w:p>
+      <w:pPr>
+        <w:pStyle w:val="Heading2"/>
+        <w:spacing w:after="120" w:before="240"/>
+      </w:pPr>
+      <w:r>
+        <w:rPr>
+          <w:rFonts w:ascii="Calibri" w:cs="Calibri" w:eastAsia="Calibri" w:hAnsi="Calibri"/>
+          <w:b/>
+          <w:bCs/>
+          <w:color w:val="1F4E79"/>
+          <w:sz w:val="28"/>
+          <w:szCs w:val="28"/>
+        </w:rPr>
+        <w:t xml:space="preserve">12.4. Результат на российских тест-профилях</w:t>
+      </w:r>
+    </w:p>
+    <w:p>
+      <w:pPr>
+        <w:spacing w:after="120" w:line="300"/>
+        <w:jc w:val="left"/>
+      </w:pPr>
+      <w:r>
+        <w:rPr>
+          <w:rFonts w:ascii="Calibri" w:cs="Calibri" w:eastAsia="Calibri" w:hAnsi="Calibri"/>
+          <w:sz w:val="22"/>
+          <w:szCs w:val="22"/>
+        </w:rPr>
+        <w:t xml:space="preserve">9 профилей с целевыми странами (популярные направления эмиграции из РФ):</w:t>
+      </w:r>
+    </w:p>
+    <w:tbl>
+      <w:tblPr>
+        <w:tblW w:type="dxa" w:w="9400"/>
+        <w:tblBorders>
+          <w:top w:val="single" w:color="auto" w:sz="4"/>
+          <w:left w:val="single" w:color="auto" w:sz="4"/>
+          <w:bottom w:val="single" w:color="auto" w:sz="4"/>
+          <w:right w:val="single" w:color="auto" w:sz="4"/>
+          <w:insideH w:val="single" w:color="auto" w:sz="4"/>
+          <w:insideV w:val="single" w:color="auto" w:sz="4"/>
+        </w:tblBorders>
+      </w:tblPr>
+      <w:tblGrid>
+        <w:gridCol w:w="3400"/>
+        <w:gridCol w:w="2000"/>
+        <w:gridCol w:w="4000"/>
+      </w:tblGrid>
+      <w:tr>
+        <w:tc>
+          <w:tcPr>
+            <w:tcW w:type="dxa" w:w="3400"/>
+            <w:tcBorders>
+              <w:top w:val="single" w:color="CCCCCC" w:sz="4"/>
+              <w:left w:val="single" w:color="CCCCCC" w:sz="4"/>
+              <w:bottom w:val="single" w:color="CCCCCC" w:sz="4"/>
+              <w:right w:val="single" w:color="CCCCCC" w:sz="4"/>
+            </w:tcBorders>
+            <w:shd w:fill="1F4E79" w:val="clear"/>
+            <w:tcMar>
+              <w:top w:type="dxa" w:w="80"/>
+              <w:left w:type="dxa" w:w="120"/>
+              <w:bottom w:type="dxa" w:w="80"/>
+              <w:right w:type="dxa" w:w="120"/>
+            </w:tcMar>
+          </w:tcPr>
+          <w:p>
+            <w:pPr>
+              <w:jc w:val="left"/>
+            </w:pPr>
+            <w:r>
+              <w:rPr>
+                <w:rFonts w:ascii="Calibri" w:cs="Calibri" w:eastAsia="Calibri" w:hAnsi="Calibri"/>
+                <w:b/>
+                <w:bCs/>
+                <w:color w:val="FFFFFF"/>
+                <w:sz w:val="20"/>
+                <w:szCs w:val="20"/>
+              </w:rPr>
+              <w:t xml:space="preserve">Целевая страна</w:t>
+            </w:r>
+          </w:p>
+        </w:tc>
+        <w:tc>
+          <w:tcPr>
+            <w:tcW w:type="dxa" w:w="2000"/>
+            <w:tcBorders>
+              <w:top w:val="single" w:color="CCCCCC" w:sz="4"/>
+              <w:left w:val="single" w:color="CCCCCC" w:sz="4"/>
+              <w:bottom w:val="single" w:color="CCCCCC" w:sz="4"/>
+              <w:right w:val="single" w:color="CCCCCC" w:sz="4"/>
+            </w:tcBorders>
+            <w:shd w:fill="1F4E79" w:val="clear"/>
+            <w:tcMar>
+              <w:top w:type="dxa" w:w="80"/>
+              <w:left w:type="dxa" w:w="120"/>
+              <w:bottom w:type="dxa" w:w="80"/>
+              <w:right w:type="dxa" w:w="120"/>
+            </w:tcMar>
+          </w:tcPr>
+          <w:p>
+            <w:pPr>
+              <w:jc w:val="center"/>
+            </w:pPr>
+            <w:r>
+              <w:rPr>
+                <w:rFonts w:ascii="Calibri" w:cs="Calibri" w:eastAsia="Calibri" w:hAnsi="Calibri"/>
+                <w:b/>
+                <w:bCs/>
+                <w:color w:val="FFFFFF"/>
+                <w:sz w:val="20"/>
+                <w:szCs w:val="20"/>
+              </w:rPr>
+              <w:t xml:space="preserve">Ранг</w:t>
+            </w:r>
+          </w:p>
+        </w:tc>
+        <w:tc>
+          <w:tcPr>
+            <w:tcW w:type="dxa" w:w="4000"/>
+            <w:tcBorders>
+              <w:top w:val="single" w:color="CCCCCC" w:sz="4"/>
+              <w:left w:val="single" w:color="CCCCCC" w:sz="4"/>
+              <w:bottom w:val="single" w:color="CCCCCC" w:sz="4"/>
+              <w:right w:val="single" w:color="CCCCCC" w:sz="4"/>
+            </w:tcBorders>
+            <w:shd w:fill="1F4E79" w:val="clear"/>
+            <w:tcMar>
+              <w:top w:type="dxa" w:w="80"/>
+              <w:left w:type="dxa" w:w="120"/>
+              <w:bottom w:type="dxa" w:w="80"/>
+              <w:right w:type="dxa" w:w="120"/>
+            </w:tcMar>
+          </w:tcPr>
+          <w:p>
+            <w:pPr>
+              <w:jc w:val="center"/>
+            </w:pPr>
+            <w:r>
+              <w:rPr>
+                <w:rFonts w:ascii="Calibri" w:cs="Calibri" w:eastAsia="Calibri" w:hAnsi="Calibri"/>
+                <w:b/>
+                <w:bCs/>
+                <w:color w:val="FFFFFF"/>
+                <w:sz w:val="20"/>
+                <w:szCs w:val="20"/>
+              </w:rPr>
+              <w:t xml:space="preserve">NDCG@10</w:t>
+            </w:r>
+          </w:p>
+        </w:tc>
+      </w:tr>
+      <w:tr>
+        <w:tc>
+          <w:tcPr>
+            <w:tcW w:type="dxa" w:w="3400"/>
+            <w:tcBorders>
+              <w:top w:val="single" w:color="CCCCCC" w:sz="4"/>
+              <w:left w:val="single" w:color="CCCCCC" w:sz="4"/>
+              <w:bottom w:val="single" w:color="CCCCCC" w:sz="4"/>
+              <w:right w:val="single" w:color="CCCCCC" w:sz="4"/>
+            </w:tcBorders>
+            <w:tcMar>
+              <w:top w:type="dxa" w:w="80"/>
+              <w:left w:type="dxa" w:w="120"/>
+              <w:bottom w:type="dxa" w:w="80"/>
+              <w:right w:type="dxa" w:w="120"/>
+            </w:tcMar>
+          </w:tcPr>
+          <w:p>
+            <w:pPr>
+              <w:jc w:val="left"/>
+            </w:pPr>
+            <w:r>
+              <w:rPr>
+                <w:rFonts w:ascii="Calibri" w:cs="Calibri" w:eastAsia="Calibri" w:hAnsi="Calibri"/>
+                <w:color w:val="000000"/>
+                <w:sz w:val="20"/>
+                <w:szCs w:val="20"/>
+              </w:rPr>
+              <w:t xml:space="preserve">Грузия (GEO)</w:t>
+            </w:r>
+          </w:p>
+        </w:tc>
+        <w:tc>
+          <w:tcPr>
+            <w:tcW w:type="dxa" w:w="2000"/>
+            <w:tcBorders>
+              <w:top w:val="single" w:color="CCCCCC" w:sz="4"/>
+              <w:left w:val="single" w:color="CCCCCC" w:sz="4"/>
+              <w:bottom w:val="single" w:color="CCCCCC" w:sz="4"/>
+              <w:right w:val="single" w:color="CCCCCC" w:sz="4"/>
+            </w:tcBorders>
+            <w:tcMar>
+              <w:top w:type="dxa" w:w="80"/>
+              <w:left w:type="dxa" w:w="120"/>
+              <w:bottom w:type="dxa" w:w="80"/>
+              <w:right w:type="dxa" w:w="120"/>
+            </w:tcMar>
+          </w:tcPr>
+          <w:p>
+            <w:pPr>
+              <w:jc w:val="center"/>
+            </w:pPr>
+            <w:r>
+              <w:rPr>
+                <w:rFonts w:ascii="Calibri" w:cs="Calibri" w:eastAsia="Calibri" w:hAnsi="Calibri"/>
+                <w:color w:val="000000"/>
+                <w:sz w:val="20"/>
+                <w:szCs w:val="20"/>
+              </w:rPr>
+              <w:t xml:space="preserve">1</w:t>
+            </w:r>
+          </w:p>
+        </w:tc>
+        <w:tc>
+          <w:tcPr>
+            <w:tcW w:type="dxa" w:w="4000"/>
+            <w:tcBorders>
+              <w:top w:val="single" w:color="CCCCCC" w:sz="4"/>
+              <w:left w:val="single" w:color="CCCCCC" w:sz="4"/>
+              <w:bottom w:val="single" w:color="CCCCCC" w:sz="4"/>
+              <w:right w:val="single" w:color="CCCCCC" w:sz="4"/>
+            </w:tcBorders>
+            <w:tcMar>
+              <w:top w:type="dxa" w:w="80"/>
+              <w:left w:type="dxa" w:w="120"/>
+              <w:bottom w:type="dxa" w:w="80"/>
+              <w:right w:type="dxa" w:w="120"/>
+            </w:tcMar>
+          </w:tcPr>
+          <w:p>
+            <w:pPr>
+              <w:jc w:val="center"/>
+            </w:pPr>
+            <w:r>
+              <w:rPr>
+                <w:rFonts w:ascii="Calibri" w:cs="Calibri" w:eastAsia="Calibri" w:hAnsi="Calibri"/>
+                <w:color w:val="000000"/>
+                <w:sz w:val="20"/>
+                <w:szCs w:val="20"/>
+              </w:rPr>
+              <w:t xml:space="preserve">1.0000</w:t>
+            </w:r>
+          </w:p>
+        </w:tc>
+      </w:tr>
+      <w:tr>
+        <w:tc>
+          <w:tcPr>
+            <w:tcW w:type="dxa" w:w="3400"/>
+            <w:tcBorders>
+              <w:top w:val="single" w:color="CCCCCC" w:sz="4"/>
+              <w:left w:val="single" w:color="CCCCCC" w:sz="4"/>
+              <w:bottom w:val="single" w:color="CCCCCC" w:sz="4"/>
+              <w:right w:val="single" w:color="CCCCCC" w:sz="4"/>
+            </w:tcBorders>
+            <w:shd w:fill="D5E8F0" w:val="clear"/>
+            <w:tcMar>
+              <w:top w:type="dxa" w:w="80"/>
+              <w:left w:type="dxa" w:w="120"/>
+              <w:bottom w:type="dxa" w:w="80"/>
+              <w:right w:type="dxa" w:w="120"/>
+            </w:tcMar>
+          </w:tcPr>
+          <w:p>
+            <w:pPr>
+              <w:jc w:val="left"/>
+            </w:pPr>
+            <w:r>
+              <w:rPr>
+                <w:rFonts w:ascii="Calibri" w:cs="Calibri" w:eastAsia="Calibri" w:hAnsi="Calibri"/>
+                <w:color w:val="000000"/>
+                <w:sz w:val="20"/>
+                <w:szCs w:val="20"/>
+              </w:rPr>
+              <w:t xml:space="preserve">Сербия (SRB)</w:t>
+            </w:r>
+          </w:p>
+        </w:tc>
+        <w:tc>
+          <w:tcPr>
+            <w:tcW w:type="dxa" w:w="2000"/>
+            <w:tcBorders>
+              <w:top w:val="single" w:color="CCCCCC" w:sz="4"/>
+              <w:left w:val="single" w:color="CCCCCC" w:sz="4"/>
+              <w:bottom w:val="single" w:color="CCCCCC" w:sz="4"/>
+              <w:right w:val="single" w:color="CCCCCC" w:sz="4"/>
+            </w:tcBorders>
+            <w:shd w:fill="D5E8F0" w:val="clear"/>
+            <w:tcMar>
+              <w:top w:type="dxa" w:w="80"/>
+              <w:left w:type="dxa" w:w="120"/>
+              <w:bottom w:type="dxa" w:w="80"/>
+              <w:right w:type="dxa" w:w="120"/>
+            </w:tcMar>
+          </w:tcPr>
+          <w:p>
+            <w:pPr>
+              <w:jc w:val="center"/>
+            </w:pPr>
+            <w:r>
+              <w:rPr>
+                <w:rFonts w:ascii="Calibri" w:cs="Calibri" w:eastAsia="Calibri" w:hAnsi="Calibri"/>
+                <w:color w:val="000000"/>
+                <w:sz w:val="20"/>
+                <w:szCs w:val="20"/>
+              </w:rPr>
+              <w:t xml:space="preserve">1</w:t>
+            </w:r>
+          </w:p>
+        </w:tc>
+        <w:tc>
+          <w:tcPr>
+            <w:tcW w:type="dxa" w:w="4000"/>
+            <w:tcBorders>
+              <w:top w:val="single" w:color="CCCCCC" w:sz="4"/>
+              <w:left w:val="single" w:color="CCCCCC" w:sz="4"/>
+              <w:bottom w:val="single" w:color="CCCCCC" w:sz="4"/>
+              <w:right w:val="single" w:color="CCCCCC" w:sz="4"/>
+            </w:tcBorders>
+            <w:shd w:fill="D5E8F0" w:val="clear"/>
+            <w:tcMar>
+              <w:top w:type="dxa" w:w="80"/>
+              <w:left w:type="dxa" w:w="120"/>
+              <w:bottom w:type="dxa" w:w="80"/>
+              <w:right w:type="dxa" w:w="120"/>
+            </w:tcMar>
+          </w:tcPr>
+          <w:p>
+            <w:pPr>
+              <w:jc w:val="center"/>
+            </w:pPr>
+            <w:r>
+              <w:rPr>
+                <w:rFonts w:ascii="Calibri" w:cs="Calibri" w:eastAsia="Calibri" w:hAnsi="Calibri"/>
+                <w:color w:val="000000"/>
+                <w:sz w:val="20"/>
+                <w:szCs w:val="20"/>
+              </w:rPr>
+              <w:t xml:space="preserve">1.0000</w:t>
+            </w:r>
+          </w:p>
+        </w:tc>
+      </w:tr>
+      <w:tr>
+        <w:tc>
+          <w:tcPr>
+            <w:tcW w:type="dxa" w:w="3400"/>
+            <w:tcBorders>
+              <w:top w:val="single" w:color="CCCCCC" w:sz="4"/>
+              <w:left w:val="single" w:color="CCCCCC" w:sz="4"/>
+              <w:bottom w:val="single" w:color="CCCCCC" w:sz="4"/>
+              <w:right w:val="single" w:color="CCCCCC" w:sz="4"/>
+            </w:tcBorders>
+            <w:tcMar>
+              <w:top w:type="dxa" w:w="80"/>
+              <w:left w:type="dxa" w:w="120"/>
+              <w:bottom w:type="dxa" w:w="80"/>
+              <w:right w:type="dxa" w:w="120"/>
+            </w:tcMar>
+          </w:tcPr>
+          <w:p>
+            <w:pPr>
+              <w:jc w:val="left"/>
+            </w:pPr>
+            <w:r>
+              <w:rPr>
+                <w:rFonts w:ascii="Calibri" w:cs="Calibri" w:eastAsia="Calibri" w:hAnsi="Calibri"/>
+                <w:color w:val="000000"/>
+                <w:sz w:val="20"/>
+                <w:szCs w:val="20"/>
+              </w:rPr>
+              <w:t xml:space="preserve">ОАЭ (ARE)</w:t>
+            </w:r>
+          </w:p>
+        </w:tc>
+        <w:tc>
+          <w:tcPr>
+            <w:tcW w:type="dxa" w:w="2000"/>
+            <w:tcBorders>
+              <w:top w:val="single" w:color="CCCCCC" w:sz="4"/>
+              <w:left w:val="single" w:color="CCCCCC" w:sz="4"/>
+              <w:bottom w:val="single" w:color="CCCCCC" w:sz="4"/>
+              <w:right w:val="single" w:color="CCCCCC" w:sz="4"/>
+            </w:tcBorders>
+            <w:tcMar>
+              <w:top w:type="dxa" w:w="80"/>
+              <w:left w:type="dxa" w:w="120"/>
+              <w:bottom w:type="dxa" w:w="80"/>
+              <w:right w:type="dxa" w:w="120"/>
+            </w:tcMar>
+          </w:tcPr>
+          <w:p>
+            <w:pPr>
+              <w:jc w:val="center"/>
+            </w:pPr>
+            <w:r>
+              <w:rPr>
+                <w:rFonts w:ascii="Calibri" w:cs="Calibri" w:eastAsia="Calibri" w:hAnsi="Calibri"/>
+                <w:color w:val="000000"/>
+                <w:sz w:val="20"/>
+                <w:szCs w:val="20"/>
+              </w:rPr>
+              <w:t xml:space="preserve">1</w:t>
+            </w:r>
+          </w:p>
+        </w:tc>
+        <w:tc>
+          <w:tcPr>
+            <w:tcW w:type="dxa" w:w="4000"/>
+            <w:tcBorders>
+              <w:top w:val="single" w:color="CCCCCC" w:sz="4"/>
+              <w:left w:val="single" w:color="CCCCCC" w:sz="4"/>
+              <w:bottom w:val="single" w:color="CCCCCC" w:sz="4"/>
+              <w:right w:val="single" w:color="CCCCCC" w:sz="4"/>
+            </w:tcBorders>
+            <w:tcMar>
+              <w:top w:type="dxa" w:w="80"/>
+              <w:left w:type="dxa" w:w="120"/>
+              <w:bottom w:type="dxa" w:w="80"/>
+              <w:right w:type="dxa" w:w="120"/>
+            </w:tcMar>
+          </w:tcPr>
+          <w:p>
+            <w:pPr>
+              <w:jc w:val="center"/>
+            </w:pPr>
+            <w:r>
+              <w:rPr>
+                <w:rFonts w:ascii="Calibri" w:cs="Calibri" w:eastAsia="Calibri" w:hAnsi="Calibri"/>
+                <w:color w:val="000000"/>
+                <w:sz w:val="20"/>
+                <w:szCs w:val="20"/>
+              </w:rPr>
+              <w:t xml:space="preserve">1.0000</w:t>
+            </w:r>
+          </w:p>
+        </w:tc>
+      </w:tr>
+      <w:tr>
+        <w:tc>
+          <w:tcPr>
+            <w:tcW w:type="dxa" w:w="3400"/>
+            <w:tcBorders>
+              <w:top w:val="single" w:color="CCCCCC" w:sz="4"/>
+              <w:left w:val="single" w:color="CCCCCC" w:sz="4"/>
+              <w:bottom w:val="single" w:color="CCCCCC" w:sz="4"/>
+              <w:right w:val="single" w:color="CCCCCC" w:sz="4"/>
+            </w:tcBorders>
+            <w:shd w:fill="D5E8F0" w:val="clear"/>
+            <w:tcMar>
+              <w:top w:type="dxa" w:w="80"/>
+              <w:left w:type="dxa" w:w="120"/>
+              <w:bottom w:type="dxa" w:w="80"/>
+              <w:right w:type="dxa" w:w="120"/>
+            </w:tcMar>
+          </w:tcPr>
+          <w:p>
+            <w:pPr>
+              <w:jc w:val="left"/>
+            </w:pPr>
+            <w:r>
+              <w:rPr>
+                <w:rFonts w:ascii="Calibri" w:cs="Calibri" w:eastAsia="Calibri" w:hAnsi="Calibri"/>
+                <w:color w:val="000000"/>
+                <w:sz w:val="20"/>
+                <w:szCs w:val="20"/>
+              </w:rPr>
+              <w:t xml:space="preserve">Таиланд (THA)</w:t>
+            </w:r>
+          </w:p>
+        </w:tc>
+        <w:tc>
+          <w:tcPr>
+            <w:tcW w:type="dxa" w:w="2000"/>
+            <w:tcBorders>
+              <w:top w:val="single" w:color="CCCCCC" w:sz="4"/>
+              <w:left w:val="single" w:color="CCCCCC" w:sz="4"/>
+              <w:bottom w:val="single" w:color="CCCCCC" w:sz="4"/>
+              <w:right w:val="single" w:color="CCCCCC" w:sz="4"/>
+            </w:tcBorders>
+            <w:shd w:fill="D5E8F0" w:val="clear"/>
+            <w:tcMar>
+              <w:top w:type="dxa" w:w="80"/>
+              <w:left w:type="dxa" w:w="120"/>
+              <w:bottom w:type="dxa" w:w="80"/>
+              <w:right w:type="dxa" w:w="120"/>
+            </w:tcMar>
+          </w:tcPr>
+          <w:p>
+            <w:pPr>
+              <w:jc w:val="center"/>
+            </w:pPr>
+            <w:r>
+              <w:rPr>
+                <w:rFonts w:ascii="Calibri" w:cs="Calibri" w:eastAsia="Calibri" w:hAnsi="Calibri"/>
+                <w:color w:val="000000"/>
+                <w:sz w:val="20"/>
+                <w:szCs w:val="20"/>
+              </w:rPr>
+              <w:t xml:space="preserve">1</w:t>
+            </w:r>
+          </w:p>
+        </w:tc>
+        <w:tc>
+          <w:tcPr>
+            <w:tcW w:type="dxa" w:w="4000"/>
+            <w:tcBorders>
+              <w:top w:val="single" w:color="CCCCCC" w:sz="4"/>
+              <w:left w:val="single" w:color="CCCCCC" w:sz="4"/>
+              <w:bottom w:val="single" w:color="CCCCCC" w:sz="4"/>
+              <w:right w:val="single" w:color="CCCCCC" w:sz="4"/>
+            </w:tcBorders>
+            <w:shd w:fill="D5E8F0" w:val="clear"/>
+            <w:tcMar>
+              <w:top w:type="dxa" w:w="80"/>
+              <w:left w:type="dxa" w:w="120"/>
+              <w:bottom w:type="dxa" w:w="80"/>
+              <w:right w:type="dxa" w:w="120"/>
+            </w:tcMar>
+          </w:tcPr>
+          <w:p>
+            <w:pPr>
+              <w:jc w:val="center"/>
+            </w:pPr>
+            <w:r>
+              <w:rPr>
+                <w:rFonts w:ascii="Calibri" w:cs="Calibri" w:eastAsia="Calibri" w:hAnsi="Calibri"/>
+                <w:color w:val="000000"/>
+                <w:sz w:val="20"/>
+                <w:szCs w:val="20"/>
+              </w:rPr>
+              <w:t xml:space="preserve">1.0000</w:t>
+            </w:r>
+          </w:p>
+        </w:tc>
+      </w:tr>
+      <w:tr>
+        <w:tc>
+          <w:tcPr>
+            <w:tcW w:type="dxa" w:w="3400"/>
+            <w:tcBorders>
+              <w:top w:val="single" w:color="CCCCCC" w:sz="4"/>
+              <w:left w:val="single" w:color="CCCCCC" w:sz="4"/>
+              <w:bottom w:val="single" w:color="CCCCCC" w:sz="4"/>
+              <w:right w:val="single" w:color="CCCCCC" w:sz="4"/>
+            </w:tcBorders>
+            <w:tcMar>
+              <w:top w:type="dxa" w:w="80"/>
+              <w:left w:type="dxa" w:w="120"/>
+              <w:bottom w:type="dxa" w:w="80"/>
+              <w:right w:type="dxa" w:w="120"/>
+            </w:tcMar>
+          </w:tcPr>
+          <w:p>
+            <w:pPr>
+              <w:jc w:val="left"/>
+            </w:pPr>
+            <w:r>
+              <w:rPr>
+                <w:rFonts w:ascii="Calibri" w:cs="Calibri" w:eastAsia="Calibri" w:hAnsi="Calibri"/>
+                <w:color w:val="000000"/>
+                <w:sz w:val="20"/>
+                <w:szCs w:val="20"/>
+              </w:rPr>
+              <w:t xml:space="preserve">Армения (ARM)</w:t>
+            </w:r>
+          </w:p>
+        </w:tc>
+        <w:tc>
+          <w:tcPr>
+            <w:tcW w:type="dxa" w:w="2000"/>
+            <w:tcBorders>
+              <w:top w:val="single" w:color="CCCCCC" w:sz="4"/>
+              <w:left w:val="single" w:color="CCCCCC" w:sz="4"/>
+              <w:bottom w:val="single" w:color="CCCCCC" w:sz="4"/>
+              <w:right w:val="single" w:color="CCCCCC" w:sz="4"/>
+            </w:tcBorders>
+            <w:tcMar>
+              <w:top w:type="dxa" w:w="80"/>
+              <w:left w:type="dxa" w:w="120"/>
+              <w:bottom w:type="dxa" w:w="80"/>
+              <w:right w:type="dxa" w:w="120"/>
+            </w:tcMar>
+          </w:tcPr>
+          <w:p>
+            <w:pPr>
+              <w:jc w:val="center"/>
+            </w:pPr>
+            <w:r>
+              <w:rPr>
+                <w:rFonts w:ascii="Calibri" w:cs="Calibri" w:eastAsia="Calibri" w:hAnsi="Calibri"/>
+                <w:color w:val="000000"/>
+                <w:sz w:val="20"/>
+                <w:szCs w:val="20"/>
+              </w:rPr>
+              <w:t xml:space="preserve">2</w:t>
+            </w:r>
+          </w:p>
+        </w:tc>
+        <w:tc>
+          <w:tcPr>
+            <w:tcW w:type="dxa" w:w="4000"/>
+            <w:tcBorders>
+              <w:top w:val="single" w:color="CCCCCC" w:sz="4"/>
+              <w:left w:val="single" w:color="CCCCCC" w:sz="4"/>
+              <w:bottom w:val="single" w:color="CCCCCC" w:sz="4"/>
+              <w:right w:val="single" w:color="CCCCCC" w:sz="4"/>
+            </w:tcBorders>
+            <w:tcMar>
+              <w:top w:type="dxa" w:w="80"/>
+              <w:left w:type="dxa" w:w="120"/>
+              <w:bottom w:type="dxa" w:w="80"/>
+              <w:right w:type="dxa" w:w="120"/>
+            </w:tcMar>
+          </w:tcPr>
+          <w:p>
+            <w:pPr>
+              <w:jc w:val="center"/>
+            </w:pPr>
+            <w:r>
+              <w:rPr>
+                <w:rFonts w:ascii="Calibri" w:cs="Calibri" w:eastAsia="Calibri" w:hAnsi="Calibri"/>
+                <w:color w:val="000000"/>
+                <w:sz w:val="20"/>
+                <w:szCs w:val="20"/>
+              </w:rPr>
+              <w:t xml:space="preserve">0.6309</w:t>
+            </w:r>
+          </w:p>
+        </w:tc>
+      </w:tr>
+      <w:tr>
+        <w:tc>
+          <w:tcPr>
+            <w:tcW w:type="dxa" w:w="3400"/>
+            <w:tcBorders>
+              <w:top w:val="single" w:color="CCCCCC" w:sz="4"/>
+              <w:left w:val="single" w:color="CCCCCC" w:sz="4"/>
+              <w:bottom w:val="single" w:color="CCCCCC" w:sz="4"/>
+              <w:right w:val="single" w:color="CCCCCC" w:sz="4"/>
+            </w:tcBorders>
+            <w:shd w:fill="D5E8F0" w:val="clear"/>
+            <w:tcMar>
+              <w:top w:type="dxa" w:w="80"/>
+              <w:left w:type="dxa" w:w="120"/>
+              <w:bottom w:type="dxa" w:w="80"/>
+              <w:right w:type="dxa" w:w="120"/>
+            </w:tcMar>
+          </w:tcPr>
+          <w:p>
+            <w:pPr>
+              <w:jc w:val="left"/>
+            </w:pPr>
+            <w:r>
+              <w:rPr>
+                <w:rFonts w:ascii="Calibri" w:cs="Calibri" w:eastAsia="Calibri" w:hAnsi="Calibri"/>
+                <w:color w:val="000000"/>
+                <w:sz w:val="20"/>
+                <w:szCs w:val="20"/>
+              </w:rPr>
+              <w:t xml:space="preserve">Черногория (MNE)</w:t>
+            </w:r>
+          </w:p>
+        </w:tc>
+        <w:tc>
+          <w:tcPr>
+            <w:tcW w:type="dxa" w:w="2000"/>
+            <w:tcBorders>
+              <w:top w:val="single" w:color="CCCCCC" w:sz="4"/>
+              <w:left w:val="single" w:color="CCCCCC" w:sz="4"/>
+              <w:bottom w:val="single" w:color="CCCCCC" w:sz="4"/>
+              <w:right w:val="single" w:color="CCCCCC" w:sz="4"/>
+            </w:tcBorders>
+            <w:shd w:fill="D5E8F0" w:val="clear"/>
+            <w:tcMar>
+              <w:top w:type="dxa" w:w="80"/>
+              <w:left w:type="dxa" w:w="120"/>
+              <w:bottom w:type="dxa" w:w="80"/>
+              <w:right w:type="dxa" w:w="120"/>
+            </w:tcMar>
+          </w:tcPr>
+          <w:p>
+            <w:pPr>
+              <w:jc w:val="center"/>
+            </w:pPr>
+            <w:r>
+              <w:rPr>
+                <w:rFonts w:ascii="Calibri" w:cs="Calibri" w:eastAsia="Calibri" w:hAnsi="Calibri"/>
+                <w:color w:val="000000"/>
+                <w:sz w:val="20"/>
+                <w:szCs w:val="20"/>
+              </w:rPr>
+              <w:t xml:space="preserve">3</w:t>
+            </w:r>
+          </w:p>
+        </w:tc>
+        <w:tc>
+          <w:tcPr>
+            <w:tcW w:type="dxa" w:w="4000"/>
+            <w:tcBorders>
+              <w:top w:val="single" w:color="CCCCCC" w:sz="4"/>
+              <w:left w:val="single" w:color="CCCCCC" w:sz="4"/>
+              <w:bottom w:val="single" w:color="CCCCCC" w:sz="4"/>
+              <w:right w:val="single" w:color="CCCCCC" w:sz="4"/>
+            </w:tcBorders>
+            <w:shd w:fill="D5E8F0" w:val="clear"/>
+            <w:tcMar>
+              <w:top w:type="dxa" w:w="80"/>
+              <w:left w:type="dxa" w:w="120"/>
+              <w:bottom w:type="dxa" w:w="80"/>
+              <w:right w:type="dxa" w:w="120"/>
+            </w:tcMar>
+          </w:tcPr>
+          <w:p>
+            <w:pPr>
+              <w:jc w:val="center"/>
+            </w:pPr>
+            <w:r>
+              <w:rPr>
+                <w:rFonts w:ascii="Calibri" w:cs="Calibri" w:eastAsia="Calibri" w:hAnsi="Calibri"/>
+                <w:color w:val="000000"/>
+                <w:sz w:val="20"/>
+                <w:szCs w:val="20"/>
+              </w:rPr>
+              <w:t xml:space="preserve">0.5000</w:t>
+            </w:r>
+          </w:p>
+        </w:tc>
+      </w:tr>
+      <w:tr>
+        <w:tc>
+          <w:tcPr>
+            <w:tcW w:type="dxa" w:w="3400"/>
+            <w:tcBorders>
+              <w:top w:val="single" w:color="CCCCCC" w:sz="4"/>
+              <w:left w:val="single" w:color="CCCCCC" w:sz="4"/>
+              <w:bottom w:val="single" w:color="CCCCCC" w:sz="4"/>
+              <w:right w:val="single" w:color="CCCCCC" w:sz="4"/>
+            </w:tcBorders>
+            <w:tcMar>
+              <w:top w:type="dxa" w:w="80"/>
+              <w:left w:type="dxa" w:w="120"/>
+              <w:bottom w:type="dxa" w:w="80"/>
+              <w:right w:type="dxa" w:w="120"/>
+            </w:tcMar>
+          </w:tcPr>
+          <w:p>
+            <w:pPr>
+              <w:jc w:val="left"/>
+            </w:pPr>
+            <w:r>
+              <w:rPr>
+                <w:rFonts w:ascii="Calibri" w:cs="Calibri" w:eastAsia="Calibri" w:hAnsi="Calibri"/>
+                <w:color w:val="000000"/>
+                <w:sz w:val="20"/>
+                <w:szCs w:val="20"/>
+              </w:rPr>
+              <w:t xml:space="preserve">Индонезия (IDN)</w:t>
+            </w:r>
+          </w:p>
+        </w:tc>
+        <w:tc>
+          <w:tcPr>
+            <w:tcW w:type="dxa" w:w="2000"/>
+            <w:tcBorders>
+              <w:top w:val="single" w:color="CCCCCC" w:sz="4"/>
+              <w:left w:val="single" w:color="CCCCCC" w:sz="4"/>
+              <w:bottom w:val="single" w:color="CCCCCC" w:sz="4"/>
+              <w:right w:val="single" w:color="CCCCCC" w:sz="4"/>
+            </w:tcBorders>
+            <w:tcMar>
+              <w:top w:type="dxa" w:w="80"/>
+              <w:left w:type="dxa" w:w="120"/>
+              <w:bottom w:type="dxa" w:w="80"/>
+              <w:right w:type="dxa" w:w="120"/>
+            </w:tcMar>
+          </w:tcPr>
+          <w:p>
+            <w:pPr>
+              <w:jc w:val="center"/>
+            </w:pPr>
+            <w:r>
+              <w:rPr>
+                <w:rFonts w:ascii="Calibri" w:cs="Calibri" w:eastAsia="Calibri" w:hAnsi="Calibri"/>
+                <w:color w:val="000000"/>
+                <w:sz w:val="20"/>
+                <w:szCs w:val="20"/>
+              </w:rPr>
+              <w:t xml:space="preserve">3</w:t>
+            </w:r>
+          </w:p>
+        </w:tc>
+        <w:tc>
+          <w:tcPr>
+            <w:tcW w:type="dxa" w:w="4000"/>
+            <w:tcBorders>
+              <w:top w:val="single" w:color="CCCCCC" w:sz="4"/>
+              <w:left w:val="single" w:color="CCCCCC" w:sz="4"/>
+              <w:bottom w:val="single" w:color="CCCCCC" w:sz="4"/>
+              <w:right w:val="single" w:color="CCCCCC" w:sz="4"/>
+            </w:tcBorders>
+            <w:tcMar>
+              <w:top w:type="dxa" w:w="80"/>
+              <w:left w:type="dxa" w:w="120"/>
+              <w:bottom w:type="dxa" w:w="80"/>
+              <w:right w:type="dxa" w:w="120"/>
+            </w:tcMar>
+          </w:tcPr>
+          <w:p>
+            <w:pPr>
+              <w:jc w:val="center"/>
+            </w:pPr>
+            <w:r>
+              <w:rPr>
+                <w:rFonts w:ascii="Calibri" w:cs="Calibri" w:eastAsia="Calibri" w:hAnsi="Calibri"/>
+                <w:color w:val="000000"/>
+                <w:sz w:val="20"/>
+                <w:szCs w:val="20"/>
+              </w:rPr>
+              <w:t xml:space="preserve">0.5000</w:t>
+            </w:r>
+          </w:p>
+        </w:tc>
+      </w:tr>
+      <w:tr>
+        <w:tc>
+          <w:tcPr>
+            <w:tcW w:type="dxa" w:w="3400"/>
+            <w:tcBorders>
+              <w:top w:val="single" w:color="CCCCCC" w:sz="4"/>
+              <w:left w:val="single" w:color="CCCCCC" w:sz="4"/>
+              <w:bottom w:val="single" w:color="CCCCCC" w:sz="4"/>
+              <w:right w:val="single" w:color="CCCCCC" w:sz="4"/>
+            </w:tcBorders>
+            <w:shd w:fill="D5E8F0" w:val="clear"/>
+            <w:tcMar>
+              <w:top w:type="dxa" w:w="80"/>
+              <w:left w:type="dxa" w:w="120"/>
+              <w:bottom w:type="dxa" w:w="80"/>
+              <w:right w:type="dxa" w:w="120"/>
+            </w:tcMar>
+          </w:tcPr>
+          <w:p>
+            <w:pPr>
+              <w:jc w:val="left"/>
+            </w:pPr>
+            <w:r>
+              <w:rPr>
+                <w:rFonts w:ascii="Calibri" w:cs="Calibri" w:eastAsia="Calibri" w:hAnsi="Calibri"/>
+                <w:color w:val="000000"/>
+                <w:sz w:val="20"/>
+                <w:szCs w:val="20"/>
+              </w:rPr>
+              <w:t xml:space="preserve">Аргентина (ARG)</w:t>
+            </w:r>
+          </w:p>
+        </w:tc>
+        <w:tc>
+          <w:tcPr>
+            <w:tcW w:type="dxa" w:w="2000"/>
+            <w:tcBorders>
+              <w:top w:val="single" w:color="CCCCCC" w:sz="4"/>
+              <w:left w:val="single" w:color="CCCCCC" w:sz="4"/>
+              <w:bottom w:val="single" w:color="CCCCCC" w:sz="4"/>
+              <w:right w:val="single" w:color="CCCCCC" w:sz="4"/>
+            </w:tcBorders>
+            <w:shd w:fill="D5E8F0" w:val="clear"/>
+            <w:tcMar>
+              <w:top w:type="dxa" w:w="80"/>
+              <w:left w:type="dxa" w:w="120"/>
+              <w:bottom w:type="dxa" w:w="80"/>
+              <w:right w:type="dxa" w:w="120"/>
+            </w:tcMar>
+          </w:tcPr>
+          <w:p>
+            <w:pPr>
+              <w:jc w:val="center"/>
+            </w:pPr>
+            <w:r>
+              <w:rPr>
+                <w:rFonts w:ascii="Calibri" w:cs="Calibri" w:eastAsia="Calibri" w:hAnsi="Calibri"/>
+                <w:color w:val="000000"/>
+                <w:sz w:val="20"/>
+                <w:szCs w:val="20"/>
+              </w:rPr>
+              <w:t xml:space="preserve">3</w:t>
+            </w:r>
+          </w:p>
+        </w:tc>
+        <w:tc>
+          <w:tcPr>
+            <w:tcW w:type="dxa" w:w="4000"/>
+            <w:tcBorders>
+              <w:top w:val="single" w:color="CCCCCC" w:sz="4"/>
+              <w:left w:val="single" w:color="CCCCCC" w:sz="4"/>
+              <w:bottom w:val="single" w:color="CCCCCC" w:sz="4"/>
+              <w:right w:val="single" w:color="CCCCCC" w:sz="4"/>
+            </w:tcBorders>
+            <w:shd w:fill="D5E8F0" w:val="clear"/>
+            <w:tcMar>
+              <w:top w:type="dxa" w:w="80"/>
+              <w:left w:type="dxa" w:w="120"/>
+              <w:bottom w:type="dxa" w:w="80"/>
+              <w:right w:type="dxa" w:w="120"/>
+            </w:tcMar>
+          </w:tcPr>
+          <w:p>
+            <w:pPr>
+              <w:jc w:val="center"/>
+            </w:pPr>
+            <w:r>
+              <w:rPr>
+                <w:rFonts w:ascii="Calibri" w:cs="Calibri" w:eastAsia="Calibri" w:hAnsi="Calibri"/>
+                <w:color w:val="000000"/>
+                <w:sz w:val="20"/>
+                <w:szCs w:val="20"/>
+              </w:rPr>
+              <w:t xml:space="preserve">0.5000</w:t>
+            </w:r>
+          </w:p>
+        </w:tc>
+      </w:tr>
+      <w:tr>
+        <w:tc>
+          <w:tcPr>
+            <w:tcW w:type="dxa" w:w="3400"/>
+            <w:tcBorders>
+              <w:top w:val="single" w:color="CCCCCC" w:sz="4"/>
+              <w:left w:val="single" w:color="CCCCCC" w:sz="4"/>
+              <w:bottom w:val="single" w:color="CCCCCC" w:sz="4"/>
+              <w:right w:val="single" w:color="CCCCCC" w:sz="4"/>
+            </w:tcBorders>
+            <w:tcMar>
+              <w:top w:type="dxa" w:w="80"/>
+              <w:left w:type="dxa" w:w="120"/>
+              <w:bottom w:type="dxa" w:w="80"/>
+              <w:right w:type="dxa" w:w="120"/>
+            </w:tcMar>
+          </w:tcPr>
+          <w:p>
+            <w:pPr>
+              <w:jc w:val="left"/>
+            </w:pPr>
+            <w:r>
+              <w:rPr>
+                <w:rFonts w:ascii="Calibri" w:cs="Calibri" w:eastAsia="Calibri" w:hAnsi="Calibri"/>
+                <w:color w:val="000000"/>
+                <w:sz w:val="20"/>
+                <w:szCs w:val="20"/>
+              </w:rPr>
+              <w:t xml:space="preserve">Мексика (MEX)</w:t>
+            </w:r>
+          </w:p>
+        </w:tc>
+        <w:tc>
+          <w:tcPr>
+            <w:tcW w:type="dxa" w:w="2000"/>
+            <w:tcBorders>
+              <w:top w:val="single" w:color="CCCCCC" w:sz="4"/>
+              <w:left w:val="single" w:color="CCCCCC" w:sz="4"/>
+              <w:bottom w:val="single" w:color="CCCCCC" w:sz="4"/>
+              <w:right w:val="single" w:color="CCCCCC" w:sz="4"/>
+            </w:tcBorders>
+            <w:tcMar>
+              <w:top w:type="dxa" w:w="80"/>
+              <w:left w:type="dxa" w:w="120"/>
+              <w:bottom w:type="dxa" w:w="80"/>
+              <w:right w:type="dxa" w:w="120"/>
+            </w:tcMar>
+          </w:tcPr>
+          <w:p>
+            <w:pPr>
+              <w:jc w:val="center"/>
+            </w:pPr>
+            <w:r>
+              <w:rPr>
+                <w:rFonts w:ascii="Calibri" w:cs="Calibri" w:eastAsia="Calibri" w:hAnsi="Calibri"/>
+                <w:color w:val="000000"/>
+                <w:sz w:val="20"/>
+                <w:szCs w:val="20"/>
+              </w:rPr>
+              <w:t xml:space="preserve">3</w:t>
+            </w:r>
+          </w:p>
+        </w:tc>
+        <w:tc>
+          <w:tcPr>
+            <w:tcW w:type="dxa" w:w="4000"/>
+            <w:tcBorders>
+              <w:top w:val="single" w:color="CCCCCC" w:sz="4"/>
+              <w:left w:val="single" w:color="CCCCCC" w:sz="4"/>
+              <w:bottom w:val="single" w:color="CCCCCC" w:sz="4"/>
+              <w:right w:val="single" w:color="CCCCCC" w:sz="4"/>
+            </w:tcBorders>
+            <w:tcMar>
+              <w:top w:type="dxa" w:w="80"/>
+              <w:left w:type="dxa" w:w="120"/>
+              <w:bottom w:type="dxa" w:w="80"/>
+              <w:right w:type="dxa" w:w="120"/>
+            </w:tcMar>
+          </w:tcPr>
+          <w:p>
+            <w:pPr>
+              <w:jc w:val="center"/>
+            </w:pPr>
+            <w:r>
+              <w:rPr>
+                <w:rFonts w:ascii="Calibri" w:cs="Calibri" w:eastAsia="Calibri" w:hAnsi="Calibri"/>
+                <w:color w:val="000000"/>
+                <w:sz w:val="20"/>
+                <w:szCs w:val="20"/>
+              </w:rPr>
+              <w:t xml:space="preserve">0.5000</w:t>
+            </w:r>
+          </w:p>
+        </w:tc>
+      </w:tr>
+    </w:tbl>
+    <w:p>
+      <w:pPr>
+        <w:pBdr>
+          <w:left w:val="single" w:color="1F4E79" w:sz="18" w:space="10"/>
+        </w:pBdr>
+        <w:spacing w:after="120" w:before="120"/>
+        <w:ind w:left="360"/>
+      </w:pPr>
+      <w:r>
+        <w:rPr>
+          <w:rFonts w:ascii="Calibri" w:cs="Calibri" w:eastAsia="Calibri" w:hAnsi="Calibri"/>
+          <w:i/>
+          <w:iCs/>
+          <w:color w:val="595959"/>
+          <w:sz w:val="22"/>
+          <w:szCs w:val="22"/>
+        </w:rPr>
+        <w:t xml:space="preserve">100% Hit Rate на российских профилях означает, что все 9 дружественных стран попали в рекомендации. Страны с высоким санкционным риском (EU, USA, GBR) опустились, не исчезнув полностью — пользователь сам принимает финальное решение.</w:t>
+      </w:r>
+    </w:p>
+    <w:p>
+      <w:pPr>
+        <w:pStyle w:val="Heading1"/>
+        <w:pageBreakBefore/>
+      </w:pPr>
+      <w:r>
+        <w:rPr>
+          <w:rFonts w:ascii="Calibri" w:cs="Calibri" w:eastAsia="Calibri" w:hAnsi="Calibri"/>
+          <w:b/>
+          <w:bCs/>
+          <w:color w:val="1F4E79"/>
+          <w:sz w:val="36"/>
+          <w:szCs w:val="36"/>
+        </w:rPr>
+        <w:t xml:space="preserve">13. Итоги и дальнейшие улучшения</w:t>
+      </w:r>
+    </w:p>
+    <w:p>
+      <w:pPr>
+        <w:pStyle w:val="Heading2"/>
+        <w:spacing w:after="120" w:before="240"/>
+      </w:pPr>
+      <w:r>
+        <w:rPr>
+          <w:rFonts w:ascii="Calibri" w:cs="Calibri" w:eastAsia="Calibri" w:hAnsi="Calibri"/>
+          <w:b/>
+          <w:bCs/>
+          <w:color w:val="1F4E79"/>
+          <w:sz w:val="28"/>
+          <w:szCs w:val="28"/>
+        </w:rPr>
+        <w:t xml:space="preserve">13.1. Что получилось</w:t>
       </w:r>
     </w:p>
     <w:p>
@@ -11322,7 +14537,7 @@
           <w:sz w:val="28"/>
           <w:szCs w:val="28"/>
         </w:rPr>
-        <w:t xml:space="preserve">12.2. Что можно улучшить</w:t>
+        <w:t xml:space="preserve">13.2. Что можно улучшить</w:t>
       </w:r>
     </w:p>
     <w:p>
@@ -11641,7 +14856,7 @@
           <w:sz w:val="28"/>
           <w:szCs w:val="28"/>
         </w:rPr>
-        <w:t xml:space="preserve">12.3. Заключение</w:t>
+        <w:t xml:space="preserve">13.3. Заключение</w:t>
       </w:r>
     </w:p>
     <w:p>

</xml_diff>